<commit_message>
Learning about loops and input
</commit_message>
<xml_diff>
--- a/selfdoc/12 Loops in python.docx
+++ b/selfdoc/12 Loops in python.docx
@@ -88,7 +88,7 @@
           <w:szCs w:val="24"/>
         </w:rPr>
         <w:pict>
-          <v:rect id="_x0000_i1114" style="width:0;height:1.5pt" o:hralign="center" o:hrstd="t" o:hr="t" fillcolor="#a0a0a0" stroked="f"/>
+          <v:rect id="_x0000_i1025" style="width:0;height:1.5pt" o:hralign="center" o:hrstd="t" o:hr="t" fillcolor="#a0a0a0" stroked="f"/>
         </w:pict>
       </w:r>
     </w:p>
@@ -225,7 +225,7 @@
           <w:szCs w:val="24"/>
         </w:rPr>
         <w:pict>
-          <v:rect id="_x0000_i1097" style="width:0;height:1.5pt" o:hralign="center" o:hrstd="t" o:hr="t" fillcolor="#a0a0a0" stroked="f"/>
+          <v:rect id="_x0000_i1026" style="width:0;height:1.5pt" o:hralign="center" o:hrstd="t" o:hr="t" fillcolor="#a0a0a0" stroked="f"/>
         </w:pict>
       </w:r>
     </w:p>
@@ -652,7 +652,7 @@
           <w:szCs w:val="24"/>
         </w:rPr>
         <w:pict>
-          <v:rect id="_x0000_i1098" style="width:0;height:1.5pt" o:hralign="center" o:hrstd="t" o:hr="t" fillcolor="#a0a0a0" stroked="f"/>
+          <v:rect id="_x0000_i1027" style="width:0;height:1.5pt" o:hralign="center" o:hrstd="t" o:hr="t" fillcolor="#a0a0a0" stroked="f"/>
         </w:pict>
       </w:r>
     </w:p>
@@ -1014,7 +1014,7 @@
           <w:szCs w:val="24"/>
         </w:rPr>
         <w:pict>
-          <v:rect id="_x0000_i1099" style="width:0;height:1.5pt" o:hralign="center" o:hrstd="t" o:hr="t" fillcolor="#a0a0a0" stroked="f"/>
+          <v:rect id="_x0000_i1028" style="width:0;height:1.5pt" o:hralign="center" o:hrstd="t" o:hr="t" fillcolor="#a0a0a0" stroked="f"/>
         </w:pict>
       </w:r>
     </w:p>
@@ -1303,7 +1303,7 @@
           <w:szCs w:val="24"/>
         </w:rPr>
         <w:pict>
-          <v:rect id="_x0000_i1100" style="width:0;height:1.5pt" o:hralign="center" o:hrstd="t" o:hr="t" fillcolor="#a0a0a0" stroked="f"/>
+          <v:rect id="_x0000_i1029" style="width:0;height:1.5pt" o:hralign="center" o:hrstd="t" o:hr="t" fillcolor="#a0a0a0" stroked="f"/>
         </w:pict>
       </w:r>
     </w:p>
@@ -1866,7 +1866,7 @@
           <w:szCs w:val="24"/>
         </w:rPr>
         <w:pict>
-          <v:rect id="_x0000_i1101" style="width:0;height:1.5pt" o:hralign="center" o:hrstd="t" o:hr="t" fillcolor="#a0a0a0" stroked="f"/>
+          <v:rect id="_x0000_i1030" style="width:0;height:1.5pt" o:hralign="center" o:hrstd="t" o:hr="t" fillcolor="#a0a0a0" stroked="f"/>
         </w:pict>
       </w:r>
     </w:p>
@@ -2031,7 +2031,7 @@
           <w:szCs w:val="24"/>
         </w:rPr>
         <w:pict>
-          <v:rect id="_x0000_i1102" style="width:0;height:1.5pt" o:hralign="center" o:hrstd="t" o:hr="t" fillcolor="#a0a0a0" stroked="f"/>
+          <v:rect id="_x0000_i1031" style="width:0;height:1.5pt" o:hralign="center" o:hrstd="t" o:hr="t" fillcolor="#a0a0a0" stroked="f"/>
         </w:pict>
       </w:r>
     </w:p>
@@ -2303,7 +2303,7 @@
           <w:szCs w:val="24"/>
         </w:rPr>
         <w:pict>
-          <v:rect id="_x0000_i1103" style="width:0;height:1.5pt" o:hralign="center" o:hrstd="t" o:hr="t" fillcolor="#a0a0a0" stroked="f"/>
+          <v:rect id="_x0000_i1032" style="width:0;height:1.5pt" o:hralign="center" o:hrstd="t" o:hr="t" fillcolor="#a0a0a0" stroked="f"/>
         </w:pict>
       </w:r>
     </w:p>
@@ -2546,7 +2546,7 @@
           <w:szCs w:val="24"/>
         </w:rPr>
         <w:pict>
-          <v:rect id="_x0000_i1104" style="width:0;height:1.5pt" o:hralign="center" o:hrstd="t" o:hr="t" fillcolor="#a0a0a0" stroked="f"/>
+          <v:rect id="_x0000_i1033" style="width:0;height:1.5pt" o:hralign="center" o:hrstd="t" o:hr="t" fillcolor="#a0a0a0" stroked="f"/>
         </w:pict>
       </w:r>
     </w:p>
@@ -2897,7 +2897,7 @@
           <w:szCs w:val="24"/>
         </w:rPr>
         <w:pict>
-          <v:rect id="_x0000_i1105" style="width:0;height:1.5pt" o:hralign="center" o:hrstd="t" o:hr="t" fillcolor="#a0a0a0" stroked="f"/>
+          <v:rect id="_x0000_i1034" style="width:0;height:1.5pt" o:hralign="center" o:hrstd="t" o:hr="t" fillcolor="#a0a0a0" stroked="f"/>
         </w:pict>
       </w:r>
     </w:p>
@@ -3349,7 +3349,7 @@
           <w:szCs w:val="24"/>
         </w:rPr>
         <w:pict>
-          <v:rect id="_x0000_i1106" style="width:0;height:1.5pt" o:hralign="center" o:hrstd="t" o:hr="t" fillcolor="#a0a0a0" stroked="f"/>
+          <v:rect id="_x0000_i1035" style="width:0;height:1.5pt" o:hralign="center" o:hrstd="t" o:hr="t" fillcolor="#a0a0a0" stroked="f"/>
         </w:pict>
       </w:r>
     </w:p>
@@ -3528,7 +3528,7 @@
           <w:szCs w:val="24"/>
         </w:rPr>
         <w:pict>
-          <v:rect id="_x0000_i1107" style="width:0;height:1.5pt" o:hralign="center" o:hrstd="t" o:hr="t" fillcolor="#a0a0a0" stroked="f"/>
+          <v:rect id="_x0000_i1036" style="width:0;height:1.5pt" o:hralign="center" o:hrstd="t" o:hr="t" fillcolor="#a0a0a0" stroked="f"/>
         </w:pict>
       </w:r>
     </w:p>
@@ -3743,7 +3743,7 @@
           <w:szCs w:val="24"/>
         </w:rPr>
         <w:pict>
-          <v:rect id="_x0000_i1108" style="width:0;height:1.5pt" o:hralign="center" o:hrstd="t" o:hr="t" fillcolor="#a0a0a0" stroked="f"/>
+          <v:rect id="_x0000_i1037" style="width:0;height:1.5pt" o:hralign="center" o:hrstd="t" o:hr="t" fillcolor="#a0a0a0" stroked="f"/>
         </w:pict>
       </w:r>
     </w:p>
@@ -4064,7 +4064,7 @@
           <w:szCs w:val="24"/>
         </w:rPr>
         <w:pict>
-          <v:rect id="_x0000_i1109" style="width:0;height:1.5pt" o:hralign="center" o:hrstd="t" o:hr="t" fillcolor="#a0a0a0" stroked="f"/>
+          <v:rect id="_x0000_i1038" style="width:0;height:1.5pt" o:hralign="center" o:hrstd="t" o:hr="t" fillcolor="#a0a0a0" stroked="f"/>
         </w:pict>
       </w:r>
     </w:p>
@@ -4452,78 +4452,6 @@
           <w:sz w:val="20"/>
           <w:szCs w:val="20"/>
         </w:rPr>
-        <w:t>python</w:t>
-      </w:r>
-    </w:p>
-    <w:p>
-      <w:pPr>
-        <w:tabs>
-          <w:tab w:val="left" w:pos="916"/>
-          <w:tab w:val="left" w:pos="1832"/>
-          <w:tab w:val="left" w:pos="2748"/>
-          <w:tab w:val="left" w:pos="3664"/>
-          <w:tab w:val="left" w:pos="4580"/>
-          <w:tab w:val="left" w:pos="5496"/>
-          <w:tab w:val="left" w:pos="6412"/>
-          <w:tab w:val="left" w:pos="7328"/>
-          <w:tab w:val="left" w:pos="8244"/>
-          <w:tab w:val="left" w:pos="9160"/>
-          <w:tab w:val="left" w:pos="10076"/>
-          <w:tab w:val="left" w:pos="10992"/>
-          <w:tab w:val="left" w:pos="11908"/>
-          <w:tab w:val="left" w:pos="12824"/>
-          <w:tab w:val="left" w:pos="13740"/>
-          <w:tab w:val="left" w:pos="14656"/>
-        </w:tabs>
-        <w:spacing w:after="0" w:line="240" w:lineRule="auto"/>
-        <w:rPr>
-          <w:rFonts w:ascii="Courier New" w:eastAsia="Times New Roman" w:hAnsi="Courier New" w:cs="Courier New"/>
-          <w:sz w:val="20"/>
-          <w:szCs w:val="20"/>
-        </w:rPr>
-      </w:pPr>
-      <w:r>
-        <w:rPr>
-          <w:rFonts w:ascii="Courier New" w:eastAsia="Times New Roman" w:hAnsi="Courier New" w:cs="Courier New"/>
-          <w:sz w:val="20"/>
-          <w:szCs w:val="20"/>
-        </w:rPr>
-        <w:t>CopyEdit</w:t>
-      </w:r>
-    </w:p>
-    <w:p>
-      <w:pPr>
-        <w:tabs>
-          <w:tab w:val="left" w:pos="916"/>
-          <w:tab w:val="left" w:pos="1832"/>
-          <w:tab w:val="left" w:pos="2748"/>
-          <w:tab w:val="left" w:pos="3664"/>
-          <w:tab w:val="left" w:pos="4580"/>
-          <w:tab w:val="left" w:pos="5496"/>
-          <w:tab w:val="left" w:pos="6412"/>
-          <w:tab w:val="left" w:pos="7328"/>
-          <w:tab w:val="left" w:pos="8244"/>
-          <w:tab w:val="left" w:pos="9160"/>
-          <w:tab w:val="left" w:pos="10076"/>
-          <w:tab w:val="left" w:pos="10992"/>
-          <w:tab w:val="left" w:pos="11908"/>
-          <w:tab w:val="left" w:pos="12824"/>
-          <w:tab w:val="left" w:pos="13740"/>
-          <w:tab w:val="left" w:pos="14656"/>
-        </w:tabs>
-        <w:spacing w:after="0" w:line="240" w:lineRule="auto"/>
-        <w:rPr>
-          <w:rFonts w:ascii="Courier New" w:eastAsia="Times New Roman" w:hAnsi="Courier New" w:cs="Courier New"/>
-          <w:sz w:val="20"/>
-          <w:szCs w:val="20"/>
-        </w:rPr>
-      </w:pPr>
-      <w:r>
-        <w:rPr>
-          <w:rFonts w:ascii="Courier New" w:eastAsia="Times New Roman" w:hAnsi="Courier New" w:cs="Courier New"/>
-          <w:sz w:val="20"/>
-          <w:szCs w:val="20"/>
-        </w:rPr>
         <w:t>for item in iterable:</w:t>
       </w:r>
     </w:p>
@@ -4655,7 +4583,135 @@
           <w:sz w:val="20"/>
           <w:szCs w:val="20"/>
         </w:rPr>
-        <w:t>python</w:t>
+        <w:t>for num in range(1, 6):</w:t>
+      </w:r>
+    </w:p>
+    <w:p>
+      <w:pPr>
+        <w:tabs>
+          <w:tab w:val="left" w:pos="916"/>
+          <w:tab w:val="left" w:pos="1832"/>
+          <w:tab w:val="left" w:pos="2748"/>
+          <w:tab w:val="left" w:pos="3664"/>
+          <w:tab w:val="left" w:pos="4580"/>
+          <w:tab w:val="left" w:pos="5496"/>
+          <w:tab w:val="left" w:pos="6412"/>
+          <w:tab w:val="left" w:pos="7328"/>
+          <w:tab w:val="left" w:pos="8244"/>
+          <w:tab w:val="left" w:pos="9160"/>
+          <w:tab w:val="left" w:pos="10076"/>
+          <w:tab w:val="left" w:pos="10992"/>
+          <w:tab w:val="left" w:pos="11908"/>
+          <w:tab w:val="left" w:pos="12824"/>
+          <w:tab w:val="left" w:pos="13740"/>
+          <w:tab w:val="left" w:pos="14656"/>
+        </w:tabs>
+        <w:spacing w:after="0" w:line="240" w:lineRule="auto"/>
+        <w:rPr>
+          <w:rFonts w:ascii="Courier New" w:eastAsia="Times New Roman" w:hAnsi="Courier New" w:cs="Courier New"/>
+          <w:sz w:val="20"/>
+          <w:szCs w:val="20"/>
+        </w:rPr>
+      </w:pPr>
+      <w:r>
+        <w:rPr>
+          <w:rFonts w:ascii="Courier New" w:eastAsia="Times New Roman" w:hAnsi="Courier New" w:cs="Courier New"/>
+          <w:sz w:val="20"/>
+          <w:szCs w:val="20"/>
+        </w:rPr>
+        <w:t xml:space="preserve">    if num == 3:</w:t>
+      </w:r>
+    </w:p>
+    <w:p>
+      <w:pPr>
+        <w:tabs>
+          <w:tab w:val="left" w:pos="916"/>
+          <w:tab w:val="left" w:pos="1832"/>
+          <w:tab w:val="left" w:pos="2748"/>
+          <w:tab w:val="left" w:pos="3664"/>
+          <w:tab w:val="left" w:pos="4580"/>
+          <w:tab w:val="left" w:pos="5496"/>
+          <w:tab w:val="left" w:pos="6412"/>
+          <w:tab w:val="left" w:pos="7328"/>
+          <w:tab w:val="left" w:pos="8244"/>
+          <w:tab w:val="left" w:pos="9160"/>
+          <w:tab w:val="left" w:pos="10076"/>
+          <w:tab w:val="left" w:pos="10992"/>
+          <w:tab w:val="left" w:pos="11908"/>
+          <w:tab w:val="left" w:pos="12824"/>
+          <w:tab w:val="left" w:pos="13740"/>
+          <w:tab w:val="left" w:pos="14656"/>
+        </w:tabs>
+        <w:spacing w:after="0" w:line="240" w:lineRule="auto"/>
+        <w:rPr>
+          <w:rFonts w:ascii="Courier New" w:eastAsia="Times New Roman" w:hAnsi="Courier New" w:cs="Courier New"/>
+          <w:sz w:val="20"/>
+          <w:szCs w:val="20"/>
+        </w:rPr>
+      </w:pPr>
+      <w:r>
+        <w:rPr>
+          <w:rFonts w:ascii="Courier New" w:eastAsia="Times New Roman" w:hAnsi="Courier New" w:cs="Courier New"/>
+          <w:sz w:val="20"/>
+          <w:szCs w:val="20"/>
+        </w:rPr>
+        <w:t xml:space="preserve">        break</w:t>
+      </w:r>
+    </w:p>
+    <w:p>
+      <w:pPr>
+        <w:tabs>
+          <w:tab w:val="left" w:pos="916"/>
+          <w:tab w:val="left" w:pos="1832"/>
+          <w:tab w:val="left" w:pos="2748"/>
+          <w:tab w:val="left" w:pos="3664"/>
+          <w:tab w:val="left" w:pos="4580"/>
+          <w:tab w:val="left" w:pos="5496"/>
+          <w:tab w:val="left" w:pos="6412"/>
+          <w:tab w:val="left" w:pos="7328"/>
+          <w:tab w:val="left" w:pos="8244"/>
+          <w:tab w:val="left" w:pos="9160"/>
+          <w:tab w:val="left" w:pos="10076"/>
+          <w:tab w:val="left" w:pos="10992"/>
+          <w:tab w:val="left" w:pos="11908"/>
+          <w:tab w:val="left" w:pos="12824"/>
+          <w:tab w:val="left" w:pos="13740"/>
+          <w:tab w:val="left" w:pos="14656"/>
+        </w:tabs>
+        <w:spacing w:after="0" w:line="240" w:lineRule="auto"/>
+        <w:rPr>
+          <w:rFonts w:ascii="Courier New" w:eastAsia="Times New Roman" w:hAnsi="Courier New" w:cs="Courier New"/>
+          <w:sz w:val="20"/>
+          <w:szCs w:val="20"/>
+        </w:rPr>
+      </w:pPr>
+      <w:r>
+        <w:rPr>
+          <w:rFonts w:ascii="Courier New" w:eastAsia="Times New Roman" w:hAnsi="Courier New" w:cs="Courier New"/>
+          <w:sz w:val="20"/>
+          <w:szCs w:val="20"/>
+        </w:rPr>
+        <w:t xml:space="preserve">    print(num)</w:t>
+      </w:r>
+    </w:p>
+    <w:p>
+      <w:pPr>
+        <w:spacing w:before="100" w:beforeAutospacing="1" w:after="100" w:afterAutospacing="1" w:line="240" w:lineRule="auto"/>
+        <w:rPr>
+          <w:rFonts w:ascii="Times New Roman" w:eastAsia="Times New Roman" w:hAnsi="Times New Roman" w:cs="Times New Roman"/>
+          <w:sz w:val="24"/>
+          <w:szCs w:val="24"/>
+        </w:rPr>
+      </w:pPr>
+      <w:r>
+        <w:rPr>
+          <w:rFonts w:ascii="Times New Roman" w:eastAsia="Times New Roman" w:hAnsi="Times New Roman" w:cs="Times New Roman"/>
+          <w:b/>
+          <w:bCs/>
+          <w:sz w:val="24"/>
+          <w:szCs w:val="24"/>
+        </w:rPr>
+        <w:t>Output:</w:t>
       </w:r>
     </w:p>
     <w:p>
@@ -4727,115 +4783,43 @@
           <w:sz w:val="20"/>
           <w:szCs w:val="20"/>
         </w:rPr>
-        <w:t>for num in range(1, 6):</w:t>
-      </w:r>
-    </w:p>
-    <w:p>
-      <w:pPr>
-        <w:tabs>
-          <w:tab w:val="left" w:pos="916"/>
-          <w:tab w:val="left" w:pos="1832"/>
-          <w:tab w:val="left" w:pos="2748"/>
-          <w:tab w:val="left" w:pos="3664"/>
-          <w:tab w:val="left" w:pos="4580"/>
-          <w:tab w:val="left" w:pos="5496"/>
-          <w:tab w:val="left" w:pos="6412"/>
-          <w:tab w:val="left" w:pos="7328"/>
-          <w:tab w:val="left" w:pos="8244"/>
-          <w:tab w:val="left" w:pos="9160"/>
-          <w:tab w:val="left" w:pos="10076"/>
-          <w:tab w:val="left" w:pos="10992"/>
-          <w:tab w:val="left" w:pos="11908"/>
-          <w:tab w:val="left" w:pos="12824"/>
-          <w:tab w:val="left" w:pos="13740"/>
-          <w:tab w:val="left" w:pos="14656"/>
-        </w:tabs>
-        <w:spacing w:after="0" w:line="240" w:lineRule="auto"/>
-        <w:rPr>
-          <w:rFonts w:ascii="Courier New" w:eastAsia="Times New Roman" w:hAnsi="Courier New" w:cs="Courier New"/>
-          <w:sz w:val="20"/>
-          <w:szCs w:val="20"/>
-        </w:rPr>
-      </w:pPr>
-      <w:r>
-        <w:rPr>
-          <w:rFonts w:ascii="Courier New" w:eastAsia="Times New Roman" w:hAnsi="Courier New" w:cs="Courier New"/>
-          <w:sz w:val="20"/>
-          <w:szCs w:val="20"/>
-        </w:rPr>
-        <w:t xml:space="preserve">    if num == 3:</w:t>
-      </w:r>
-    </w:p>
-    <w:p>
-      <w:pPr>
-        <w:tabs>
-          <w:tab w:val="left" w:pos="916"/>
-          <w:tab w:val="left" w:pos="1832"/>
-          <w:tab w:val="left" w:pos="2748"/>
-          <w:tab w:val="left" w:pos="3664"/>
-          <w:tab w:val="left" w:pos="4580"/>
-          <w:tab w:val="left" w:pos="5496"/>
-          <w:tab w:val="left" w:pos="6412"/>
-          <w:tab w:val="left" w:pos="7328"/>
-          <w:tab w:val="left" w:pos="8244"/>
-          <w:tab w:val="left" w:pos="9160"/>
-          <w:tab w:val="left" w:pos="10076"/>
-          <w:tab w:val="left" w:pos="10992"/>
-          <w:tab w:val="left" w:pos="11908"/>
-          <w:tab w:val="left" w:pos="12824"/>
-          <w:tab w:val="left" w:pos="13740"/>
-          <w:tab w:val="left" w:pos="14656"/>
-        </w:tabs>
-        <w:spacing w:after="0" w:line="240" w:lineRule="auto"/>
-        <w:rPr>
-          <w:rFonts w:ascii="Courier New" w:eastAsia="Times New Roman" w:hAnsi="Courier New" w:cs="Courier New"/>
-          <w:sz w:val="20"/>
-          <w:szCs w:val="20"/>
-        </w:rPr>
-      </w:pPr>
-      <w:r>
-        <w:rPr>
-          <w:rFonts w:ascii="Courier New" w:eastAsia="Times New Roman" w:hAnsi="Courier New" w:cs="Courier New"/>
-          <w:sz w:val="20"/>
-          <w:szCs w:val="20"/>
-        </w:rPr>
-        <w:t xml:space="preserve">        break</w:t>
-      </w:r>
-    </w:p>
-    <w:p>
-      <w:pPr>
-        <w:tabs>
-          <w:tab w:val="left" w:pos="916"/>
-          <w:tab w:val="left" w:pos="1832"/>
-          <w:tab w:val="left" w:pos="2748"/>
-          <w:tab w:val="left" w:pos="3664"/>
-          <w:tab w:val="left" w:pos="4580"/>
-          <w:tab w:val="left" w:pos="5496"/>
-          <w:tab w:val="left" w:pos="6412"/>
-          <w:tab w:val="left" w:pos="7328"/>
-          <w:tab w:val="left" w:pos="8244"/>
-          <w:tab w:val="left" w:pos="9160"/>
-          <w:tab w:val="left" w:pos="10076"/>
-          <w:tab w:val="left" w:pos="10992"/>
-          <w:tab w:val="left" w:pos="11908"/>
-          <w:tab w:val="left" w:pos="12824"/>
-          <w:tab w:val="left" w:pos="13740"/>
-          <w:tab w:val="left" w:pos="14656"/>
-        </w:tabs>
-        <w:spacing w:after="0" w:line="240" w:lineRule="auto"/>
-        <w:rPr>
-          <w:rFonts w:ascii="Courier New" w:eastAsia="Times New Roman" w:hAnsi="Courier New" w:cs="Courier New"/>
-          <w:sz w:val="20"/>
-          <w:szCs w:val="20"/>
-        </w:rPr>
-      </w:pPr>
-      <w:r>
-        <w:rPr>
-          <w:rFonts w:ascii="Courier New" w:eastAsia="Times New Roman" w:hAnsi="Courier New" w:cs="Courier New"/>
-          <w:sz w:val="20"/>
-          <w:szCs w:val="20"/>
-        </w:rPr>
-        <w:t xml:space="preserve">    print(num)</w:t>
+        <w:t>1</w:t>
+      </w:r>
+    </w:p>
+    <w:p>
+      <w:pPr>
+        <w:tabs>
+          <w:tab w:val="left" w:pos="916"/>
+          <w:tab w:val="left" w:pos="1832"/>
+          <w:tab w:val="left" w:pos="2748"/>
+          <w:tab w:val="left" w:pos="3664"/>
+          <w:tab w:val="left" w:pos="4580"/>
+          <w:tab w:val="left" w:pos="5496"/>
+          <w:tab w:val="left" w:pos="6412"/>
+          <w:tab w:val="left" w:pos="7328"/>
+          <w:tab w:val="left" w:pos="8244"/>
+          <w:tab w:val="left" w:pos="9160"/>
+          <w:tab w:val="left" w:pos="10076"/>
+          <w:tab w:val="left" w:pos="10992"/>
+          <w:tab w:val="left" w:pos="11908"/>
+          <w:tab w:val="left" w:pos="12824"/>
+          <w:tab w:val="left" w:pos="13740"/>
+          <w:tab w:val="left" w:pos="14656"/>
+        </w:tabs>
+        <w:spacing w:after="0" w:line="240" w:lineRule="auto"/>
+        <w:rPr>
+          <w:rFonts w:ascii="Courier New" w:eastAsia="Times New Roman" w:hAnsi="Courier New" w:cs="Courier New"/>
+          <w:sz w:val="20"/>
+          <w:szCs w:val="20"/>
+        </w:rPr>
+      </w:pPr>
+      <w:r>
+        <w:rPr>
+          <w:rFonts w:ascii="Courier New" w:eastAsia="Times New Roman" w:hAnsi="Courier New" w:cs="Courier New"/>
+          <w:sz w:val="20"/>
+          <w:szCs w:val="20"/>
+        </w:rPr>
+        <w:t>2</w:t>
       </w:r>
     </w:p>
     <w:p>
@@ -4849,134 +4833,6 @@
       </w:pPr>
       <w:r>
         <w:rPr>
-          <w:rFonts w:ascii="Times New Roman" w:eastAsia="Times New Roman" w:hAnsi="Times New Roman" w:cs="Times New Roman"/>
-          <w:b/>
-          <w:bCs/>
-          <w:sz w:val="24"/>
-          <w:szCs w:val="24"/>
-        </w:rPr>
-        <w:t>Output:</w:t>
-      </w:r>
-    </w:p>
-    <w:p>
-      <w:pPr>
-        <w:tabs>
-          <w:tab w:val="left" w:pos="916"/>
-          <w:tab w:val="left" w:pos="1832"/>
-          <w:tab w:val="left" w:pos="2748"/>
-          <w:tab w:val="left" w:pos="3664"/>
-          <w:tab w:val="left" w:pos="4580"/>
-          <w:tab w:val="left" w:pos="5496"/>
-          <w:tab w:val="left" w:pos="6412"/>
-          <w:tab w:val="left" w:pos="7328"/>
-          <w:tab w:val="left" w:pos="8244"/>
-          <w:tab w:val="left" w:pos="9160"/>
-          <w:tab w:val="left" w:pos="10076"/>
-          <w:tab w:val="left" w:pos="10992"/>
-          <w:tab w:val="left" w:pos="11908"/>
-          <w:tab w:val="left" w:pos="12824"/>
-          <w:tab w:val="left" w:pos="13740"/>
-          <w:tab w:val="left" w:pos="14656"/>
-        </w:tabs>
-        <w:spacing w:after="0" w:line="240" w:lineRule="auto"/>
-        <w:rPr>
-          <w:rFonts w:ascii="Courier New" w:eastAsia="Times New Roman" w:hAnsi="Courier New" w:cs="Courier New"/>
-          <w:sz w:val="20"/>
-          <w:szCs w:val="20"/>
-        </w:rPr>
-      </w:pPr>
-      <w:r>
-        <w:rPr>
-          <w:rFonts w:ascii="Courier New" w:eastAsia="Times New Roman" w:hAnsi="Courier New" w:cs="Courier New"/>
-          <w:sz w:val="20"/>
-          <w:szCs w:val="20"/>
-        </w:rPr>
-        <w:t>CopyEdit</w:t>
-      </w:r>
-    </w:p>
-    <w:p>
-      <w:pPr>
-        <w:tabs>
-          <w:tab w:val="left" w:pos="916"/>
-          <w:tab w:val="left" w:pos="1832"/>
-          <w:tab w:val="left" w:pos="2748"/>
-          <w:tab w:val="left" w:pos="3664"/>
-          <w:tab w:val="left" w:pos="4580"/>
-          <w:tab w:val="left" w:pos="5496"/>
-          <w:tab w:val="left" w:pos="6412"/>
-          <w:tab w:val="left" w:pos="7328"/>
-          <w:tab w:val="left" w:pos="8244"/>
-          <w:tab w:val="left" w:pos="9160"/>
-          <w:tab w:val="left" w:pos="10076"/>
-          <w:tab w:val="left" w:pos="10992"/>
-          <w:tab w:val="left" w:pos="11908"/>
-          <w:tab w:val="left" w:pos="12824"/>
-          <w:tab w:val="left" w:pos="13740"/>
-          <w:tab w:val="left" w:pos="14656"/>
-        </w:tabs>
-        <w:spacing w:after="0" w:line="240" w:lineRule="auto"/>
-        <w:rPr>
-          <w:rFonts w:ascii="Courier New" w:eastAsia="Times New Roman" w:hAnsi="Courier New" w:cs="Courier New"/>
-          <w:sz w:val="20"/>
-          <w:szCs w:val="20"/>
-        </w:rPr>
-      </w:pPr>
-      <w:r>
-        <w:rPr>
-          <w:rFonts w:ascii="Courier New" w:eastAsia="Times New Roman" w:hAnsi="Courier New" w:cs="Courier New"/>
-          <w:sz w:val="20"/>
-          <w:szCs w:val="20"/>
-        </w:rPr>
-        <w:t>1</w:t>
-      </w:r>
-    </w:p>
-    <w:p>
-      <w:pPr>
-        <w:tabs>
-          <w:tab w:val="left" w:pos="916"/>
-          <w:tab w:val="left" w:pos="1832"/>
-          <w:tab w:val="left" w:pos="2748"/>
-          <w:tab w:val="left" w:pos="3664"/>
-          <w:tab w:val="left" w:pos="4580"/>
-          <w:tab w:val="left" w:pos="5496"/>
-          <w:tab w:val="left" w:pos="6412"/>
-          <w:tab w:val="left" w:pos="7328"/>
-          <w:tab w:val="left" w:pos="8244"/>
-          <w:tab w:val="left" w:pos="9160"/>
-          <w:tab w:val="left" w:pos="10076"/>
-          <w:tab w:val="left" w:pos="10992"/>
-          <w:tab w:val="left" w:pos="11908"/>
-          <w:tab w:val="left" w:pos="12824"/>
-          <w:tab w:val="left" w:pos="13740"/>
-          <w:tab w:val="left" w:pos="14656"/>
-        </w:tabs>
-        <w:spacing w:after="0" w:line="240" w:lineRule="auto"/>
-        <w:rPr>
-          <w:rFonts w:ascii="Courier New" w:eastAsia="Times New Roman" w:hAnsi="Courier New" w:cs="Courier New"/>
-          <w:sz w:val="20"/>
-          <w:szCs w:val="20"/>
-        </w:rPr>
-      </w:pPr>
-      <w:r>
-        <w:rPr>
-          <w:rFonts w:ascii="Courier New" w:eastAsia="Times New Roman" w:hAnsi="Courier New" w:cs="Courier New"/>
-          <w:sz w:val="20"/>
-          <w:szCs w:val="20"/>
-        </w:rPr>
-        <w:t>2</w:t>
-      </w:r>
-    </w:p>
-    <w:p>
-      <w:pPr>
-        <w:spacing w:before="100" w:beforeAutospacing="1" w:after="100" w:afterAutospacing="1" w:line="240" w:lineRule="auto"/>
-        <w:rPr>
-          <w:rFonts w:ascii="Times New Roman" w:eastAsia="Times New Roman" w:hAnsi="Times New Roman" w:cs="Times New Roman"/>
-          <w:sz w:val="24"/>
-          <w:szCs w:val="24"/>
-        </w:rPr>
-      </w:pPr>
-      <w:r>
-        <w:rPr>
           <w:rFonts w:ascii="Segoe UI Symbol" w:eastAsia="Times New Roman" w:hAnsi="Segoe UI Symbol" w:cs="Segoe UI Symbol"/>
           <w:sz w:val="24"/>
           <w:szCs w:val="24"/>
@@ -5024,7 +4880,7 @@
           <w:szCs w:val="24"/>
         </w:rPr>
         <w:pict>
-          <v:rect id="_x0000_i1110" style="width:0;height:1.5pt" o:hralign="center" o:hrstd="t" o:hr="t" fillcolor="#a0a0a0" stroked="f"/>
+          <v:rect id="_x0000_i1039" style="width:0;height:1.5pt" o:hralign="center" o:hrstd="t" o:hr="t" fillcolor="#a0a0a0" stroked="f"/>
         </w:pict>
       </w:r>
     </w:p>
@@ -5139,78 +4995,6 @@
           <w:sz w:val="20"/>
           <w:szCs w:val="20"/>
         </w:rPr>
-        <w:t>python</w:t>
-      </w:r>
-    </w:p>
-    <w:p>
-      <w:pPr>
-        <w:tabs>
-          <w:tab w:val="left" w:pos="916"/>
-          <w:tab w:val="left" w:pos="1832"/>
-          <w:tab w:val="left" w:pos="2748"/>
-          <w:tab w:val="left" w:pos="3664"/>
-          <w:tab w:val="left" w:pos="4580"/>
-          <w:tab w:val="left" w:pos="5496"/>
-          <w:tab w:val="left" w:pos="6412"/>
-          <w:tab w:val="left" w:pos="7328"/>
-          <w:tab w:val="left" w:pos="8244"/>
-          <w:tab w:val="left" w:pos="9160"/>
-          <w:tab w:val="left" w:pos="10076"/>
-          <w:tab w:val="left" w:pos="10992"/>
-          <w:tab w:val="left" w:pos="11908"/>
-          <w:tab w:val="left" w:pos="12824"/>
-          <w:tab w:val="left" w:pos="13740"/>
-          <w:tab w:val="left" w:pos="14656"/>
-        </w:tabs>
-        <w:spacing w:after="0" w:line="240" w:lineRule="auto"/>
-        <w:rPr>
-          <w:rFonts w:ascii="Courier New" w:eastAsia="Times New Roman" w:hAnsi="Courier New" w:cs="Courier New"/>
-          <w:sz w:val="20"/>
-          <w:szCs w:val="20"/>
-        </w:rPr>
-      </w:pPr>
-      <w:r>
-        <w:rPr>
-          <w:rFonts w:ascii="Courier New" w:eastAsia="Times New Roman" w:hAnsi="Courier New" w:cs="Courier New"/>
-          <w:sz w:val="20"/>
-          <w:szCs w:val="20"/>
-        </w:rPr>
-        <w:t>CopyEdit</w:t>
-      </w:r>
-    </w:p>
-    <w:p>
-      <w:pPr>
-        <w:tabs>
-          <w:tab w:val="left" w:pos="916"/>
-          <w:tab w:val="left" w:pos="1832"/>
-          <w:tab w:val="left" w:pos="2748"/>
-          <w:tab w:val="left" w:pos="3664"/>
-          <w:tab w:val="left" w:pos="4580"/>
-          <w:tab w:val="left" w:pos="5496"/>
-          <w:tab w:val="left" w:pos="6412"/>
-          <w:tab w:val="left" w:pos="7328"/>
-          <w:tab w:val="left" w:pos="8244"/>
-          <w:tab w:val="left" w:pos="9160"/>
-          <w:tab w:val="left" w:pos="10076"/>
-          <w:tab w:val="left" w:pos="10992"/>
-          <w:tab w:val="left" w:pos="11908"/>
-          <w:tab w:val="left" w:pos="12824"/>
-          <w:tab w:val="left" w:pos="13740"/>
-          <w:tab w:val="left" w:pos="14656"/>
-        </w:tabs>
-        <w:spacing w:after="0" w:line="240" w:lineRule="auto"/>
-        <w:rPr>
-          <w:rFonts w:ascii="Courier New" w:eastAsia="Times New Roman" w:hAnsi="Courier New" w:cs="Courier New"/>
-          <w:sz w:val="20"/>
-          <w:szCs w:val="20"/>
-        </w:rPr>
-      </w:pPr>
-      <w:r>
-        <w:rPr>
-          <w:rFonts w:ascii="Courier New" w:eastAsia="Times New Roman" w:hAnsi="Courier New" w:cs="Courier New"/>
-          <w:sz w:val="20"/>
-          <w:szCs w:val="20"/>
-        </w:rPr>
         <w:t>for item in iterable:</w:t>
       </w:r>
     </w:p>
@@ -5342,187 +5126,187 @@
           <w:sz w:val="20"/>
           <w:szCs w:val="20"/>
         </w:rPr>
+        <w:t>python</w:t>
+      </w:r>
+    </w:p>
+    <w:p>
+      <w:pPr>
+        <w:tabs>
+          <w:tab w:val="left" w:pos="916"/>
+          <w:tab w:val="left" w:pos="1832"/>
+          <w:tab w:val="left" w:pos="2748"/>
+          <w:tab w:val="left" w:pos="3664"/>
+          <w:tab w:val="left" w:pos="4580"/>
+          <w:tab w:val="left" w:pos="5496"/>
+          <w:tab w:val="left" w:pos="6412"/>
+          <w:tab w:val="left" w:pos="7328"/>
+          <w:tab w:val="left" w:pos="8244"/>
+          <w:tab w:val="left" w:pos="9160"/>
+          <w:tab w:val="left" w:pos="10076"/>
+          <w:tab w:val="left" w:pos="10992"/>
+          <w:tab w:val="left" w:pos="11908"/>
+          <w:tab w:val="left" w:pos="12824"/>
+          <w:tab w:val="left" w:pos="13740"/>
+          <w:tab w:val="left" w:pos="14656"/>
+        </w:tabs>
+        <w:spacing w:after="0" w:line="240" w:lineRule="auto"/>
+        <w:rPr>
+          <w:rFonts w:ascii="Courier New" w:eastAsia="Times New Roman" w:hAnsi="Courier New" w:cs="Courier New"/>
+          <w:sz w:val="20"/>
+          <w:szCs w:val="20"/>
+        </w:rPr>
+      </w:pPr>
+      <w:r>
+        <w:rPr>
+          <w:rFonts w:ascii="Courier New" w:eastAsia="Times New Roman" w:hAnsi="Courier New" w:cs="Courier New"/>
+          <w:sz w:val="20"/>
+          <w:szCs w:val="20"/>
+        </w:rPr>
+        <w:t>CopyEdit</w:t>
+      </w:r>
+    </w:p>
+    <w:p>
+      <w:pPr>
+        <w:tabs>
+          <w:tab w:val="left" w:pos="916"/>
+          <w:tab w:val="left" w:pos="1832"/>
+          <w:tab w:val="left" w:pos="2748"/>
+          <w:tab w:val="left" w:pos="3664"/>
+          <w:tab w:val="left" w:pos="4580"/>
+          <w:tab w:val="left" w:pos="5496"/>
+          <w:tab w:val="left" w:pos="6412"/>
+          <w:tab w:val="left" w:pos="7328"/>
+          <w:tab w:val="left" w:pos="8244"/>
+          <w:tab w:val="left" w:pos="9160"/>
+          <w:tab w:val="left" w:pos="10076"/>
+          <w:tab w:val="left" w:pos="10992"/>
+          <w:tab w:val="left" w:pos="11908"/>
+          <w:tab w:val="left" w:pos="12824"/>
+          <w:tab w:val="left" w:pos="13740"/>
+          <w:tab w:val="left" w:pos="14656"/>
+        </w:tabs>
+        <w:spacing w:after="0" w:line="240" w:lineRule="auto"/>
+        <w:rPr>
+          <w:rFonts w:ascii="Courier New" w:eastAsia="Times New Roman" w:hAnsi="Courier New" w:cs="Courier New"/>
+          <w:sz w:val="20"/>
+          <w:szCs w:val="20"/>
+        </w:rPr>
+      </w:pPr>
+      <w:r>
+        <w:rPr>
+          <w:rFonts w:ascii="Courier New" w:eastAsia="Times New Roman" w:hAnsi="Courier New" w:cs="Courier New"/>
+          <w:sz w:val="20"/>
+          <w:szCs w:val="20"/>
+        </w:rPr>
+        <w:t>for num in range(1, 6):</w:t>
+      </w:r>
+    </w:p>
+    <w:p>
+      <w:pPr>
+        <w:tabs>
+          <w:tab w:val="left" w:pos="916"/>
+          <w:tab w:val="left" w:pos="1832"/>
+          <w:tab w:val="left" w:pos="2748"/>
+          <w:tab w:val="left" w:pos="3664"/>
+          <w:tab w:val="left" w:pos="4580"/>
+          <w:tab w:val="left" w:pos="5496"/>
+          <w:tab w:val="left" w:pos="6412"/>
+          <w:tab w:val="left" w:pos="7328"/>
+          <w:tab w:val="left" w:pos="8244"/>
+          <w:tab w:val="left" w:pos="9160"/>
+          <w:tab w:val="left" w:pos="10076"/>
+          <w:tab w:val="left" w:pos="10992"/>
+          <w:tab w:val="left" w:pos="11908"/>
+          <w:tab w:val="left" w:pos="12824"/>
+          <w:tab w:val="left" w:pos="13740"/>
+          <w:tab w:val="left" w:pos="14656"/>
+        </w:tabs>
+        <w:spacing w:after="0" w:line="240" w:lineRule="auto"/>
+        <w:rPr>
+          <w:rFonts w:ascii="Courier New" w:eastAsia="Times New Roman" w:hAnsi="Courier New" w:cs="Courier New"/>
+          <w:sz w:val="20"/>
+          <w:szCs w:val="20"/>
+        </w:rPr>
+      </w:pPr>
+      <w:r>
+        <w:rPr>
+          <w:rFonts w:ascii="Courier New" w:eastAsia="Times New Roman" w:hAnsi="Courier New" w:cs="Courier New"/>
+          <w:sz w:val="20"/>
+          <w:szCs w:val="20"/>
+        </w:rPr>
+        <w:t xml:space="preserve">    if num == 3:</w:t>
+      </w:r>
+    </w:p>
+    <w:p>
+      <w:pPr>
+        <w:tabs>
+          <w:tab w:val="left" w:pos="916"/>
+          <w:tab w:val="left" w:pos="1832"/>
+          <w:tab w:val="left" w:pos="2748"/>
+          <w:tab w:val="left" w:pos="3664"/>
+          <w:tab w:val="left" w:pos="4580"/>
+          <w:tab w:val="left" w:pos="5496"/>
+          <w:tab w:val="left" w:pos="6412"/>
+          <w:tab w:val="left" w:pos="7328"/>
+          <w:tab w:val="left" w:pos="8244"/>
+          <w:tab w:val="left" w:pos="9160"/>
+          <w:tab w:val="left" w:pos="10076"/>
+          <w:tab w:val="left" w:pos="10992"/>
+          <w:tab w:val="left" w:pos="11908"/>
+          <w:tab w:val="left" w:pos="12824"/>
+          <w:tab w:val="left" w:pos="13740"/>
+          <w:tab w:val="left" w:pos="14656"/>
+        </w:tabs>
+        <w:spacing w:after="0" w:line="240" w:lineRule="auto"/>
+        <w:rPr>
+          <w:rFonts w:ascii="Courier New" w:eastAsia="Times New Roman" w:hAnsi="Courier New" w:cs="Courier New"/>
+          <w:sz w:val="20"/>
+          <w:szCs w:val="20"/>
+        </w:rPr>
+      </w:pPr>
+      <w:r>
+        <w:rPr>
+          <w:rFonts w:ascii="Courier New" w:eastAsia="Times New Roman" w:hAnsi="Courier New" w:cs="Courier New"/>
+          <w:sz w:val="20"/>
+          <w:szCs w:val="20"/>
+        </w:rPr>
+        <w:t xml:space="preserve">        continue</w:t>
+      </w:r>
+    </w:p>
+    <w:p>
+      <w:pPr>
+        <w:tabs>
+          <w:tab w:val="left" w:pos="916"/>
+          <w:tab w:val="left" w:pos="1832"/>
+          <w:tab w:val="left" w:pos="2748"/>
+          <w:tab w:val="left" w:pos="3664"/>
+          <w:tab w:val="left" w:pos="4580"/>
+          <w:tab w:val="left" w:pos="5496"/>
+          <w:tab w:val="left" w:pos="6412"/>
+          <w:tab w:val="left" w:pos="7328"/>
+          <w:tab w:val="left" w:pos="8244"/>
+          <w:tab w:val="left" w:pos="9160"/>
+          <w:tab w:val="left" w:pos="10076"/>
+          <w:tab w:val="left" w:pos="10992"/>
+          <w:tab w:val="left" w:pos="11908"/>
+          <w:tab w:val="left" w:pos="12824"/>
+          <w:tab w:val="left" w:pos="13740"/>
+          <w:tab w:val="left" w:pos="14656"/>
+        </w:tabs>
+        <w:spacing w:after="0" w:line="240" w:lineRule="auto"/>
+        <w:rPr>
+          <w:rFonts w:ascii="Courier New" w:eastAsia="Times New Roman" w:hAnsi="Courier New" w:cs="Courier New"/>
+          <w:sz w:val="20"/>
+          <w:szCs w:val="20"/>
+        </w:rPr>
+      </w:pPr>
+      <w:r>
+        <w:rPr>
+          <w:rFonts w:ascii="Courier New" w:eastAsia="Times New Roman" w:hAnsi="Courier New" w:cs="Courier New"/>
+          <w:sz w:val="20"/>
+          <w:szCs w:val="20"/>
+        </w:rPr>
         <w:lastRenderedPageBreak/>
-        <w:t>python</w:t>
-      </w:r>
-    </w:p>
-    <w:p>
-      <w:pPr>
-        <w:tabs>
-          <w:tab w:val="left" w:pos="916"/>
-          <w:tab w:val="left" w:pos="1832"/>
-          <w:tab w:val="left" w:pos="2748"/>
-          <w:tab w:val="left" w:pos="3664"/>
-          <w:tab w:val="left" w:pos="4580"/>
-          <w:tab w:val="left" w:pos="5496"/>
-          <w:tab w:val="left" w:pos="6412"/>
-          <w:tab w:val="left" w:pos="7328"/>
-          <w:tab w:val="left" w:pos="8244"/>
-          <w:tab w:val="left" w:pos="9160"/>
-          <w:tab w:val="left" w:pos="10076"/>
-          <w:tab w:val="left" w:pos="10992"/>
-          <w:tab w:val="left" w:pos="11908"/>
-          <w:tab w:val="left" w:pos="12824"/>
-          <w:tab w:val="left" w:pos="13740"/>
-          <w:tab w:val="left" w:pos="14656"/>
-        </w:tabs>
-        <w:spacing w:after="0" w:line="240" w:lineRule="auto"/>
-        <w:rPr>
-          <w:rFonts w:ascii="Courier New" w:eastAsia="Times New Roman" w:hAnsi="Courier New" w:cs="Courier New"/>
-          <w:sz w:val="20"/>
-          <w:szCs w:val="20"/>
-        </w:rPr>
-      </w:pPr>
-      <w:r>
-        <w:rPr>
-          <w:rFonts w:ascii="Courier New" w:eastAsia="Times New Roman" w:hAnsi="Courier New" w:cs="Courier New"/>
-          <w:sz w:val="20"/>
-          <w:szCs w:val="20"/>
-        </w:rPr>
-        <w:t>CopyEdit</w:t>
-      </w:r>
-    </w:p>
-    <w:p>
-      <w:pPr>
-        <w:tabs>
-          <w:tab w:val="left" w:pos="916"/>
-          <w:tab w:val="left" w:pos="1832"/>
-          <w:tab w:val="left" w:pos="2748"/>
-          <w:tab w:val="left" w:pos="3664"/>
-          <w:tab w:val="left" w:pos="4580"/>
-          <w:tab w:val="left" w:pos="5496"/>
-          <w:tab w:val="left" w:pos="6412"/>
-          <w:tab w:val="left" w:pos="7328"/>
-          <w:tab w:val="left" w:pos="8244"/>
-          <w:tab w:val="left" w:pos="9160"/>
-          <w:tab w:val="left" w:pos="10076"/>
-          <w:tab w:val="left" w:pos="10992"/>
-          <w:tab w:val="left" w:pos="11908"/>
-          <w:tab w:val="left" w:pos="12824"/>
-          <w:tab w:val="left" w:pos="13740"/>
-          <w:tab w:val="left" w:pos="14656"/>
-        </w:tabs>
-        <w:spacing w:after="0" w:line="240" w:lineRule="auto"/>
-        <w:rPr>
-          <w:rFonts w:ascii="Courier New" w:eastAsia="Times New Roman" w:hAnsi="Courier New" w:cs="Courier New"/>
-          <w:sz w:val="20"/>
-          <w:szCs w:val="20"/>
-        </w:rPr>
-      </w:pPr>
-      <w:r>
-        <w:rPr>
-          <w:rFonts w:ascii="Courier New" w:eastAsia="Times New Roman" w:hAnsi="Courier New" w:cs="Courier New"/>
-          <w:sz w:val="20"/>
-          <w:szCs w:val="20"/>
-        </w:rPr>
-        <w:t>for num in range(1, 6):</w:t>
-      </w:r>
-    </w:p>
-    <w:p>
-      <w:pPr>
-        <w:tabs>
-          <w:tab w:val="left" w:pos="916"/>
-          <w:tab w:val="left" w:pos="1832"/>
-          <w:tab w:val="left" w:pos="2748"/>
-          <w:tab w:val="left" w:pos="3664"/>
-          <w:tab w:val="left" w:pos="4580"/>
-          <w:tab w:val="left" w:pos="5496"/>
-          <w:tab w:val="left" w:pos="6412"/>
-          <w:tab w:val="left" w:pos="7328"/>
-          <w:tab w:val="left" w:pos="8244"/>
-          <w:tab w:val="left" w:pos="9160"/>
-          <w:tab w:val="left" w:pos="10076"/>
-          <w:tab w:val="left" w:pos="10992"/>
-          <w:tab w:val="left" w:pos="11908"/>
-          <w:tab w:val="left" w:pos="12824"/>
-          <w:tab w:val="left" w:pos="13740"/>
-          <w:tab w:val="left" w:pos="14656"/>
-        </w:tabs>
-        <w:spacing w:after="0" w:line="240" w:lineRule="auto"/>
-        <w:rPr>
-          <w:rFonts w:ascii="Courier New" w:eastAsia="Times New Roman" w:hAnsi="Courier New" w:cs="Courier New"/>
-          <w:sz w:val="20"/>
-          <w:szCs w:val="20"/>
-        </w:rPr>
-      </w:pPr>
-      <w:r>
-        <w:rPr>
-          <w:rFonts w:ascii="Courier New" w:eastAsia="Times New Roman" w:hAnsi="Courier New" w:cs="Courier New"/>
-          <w:sz w:val="20"/>
-          <w:szCs w:val="20"/>
-        </w:rPr>
-        <w:t xml:space="preserve">    if num == 3:</w:t>
-      </w:r>
-    </w:p>
-    <w:p>
-      <w:pPr>
-        <w:tabs>
-          <w:tab w:val="left" w:pos="916"/>
-          <w:tab w:val="left" w:pos="1832"/>
-          <w:tab w:val="left" w:pos="2748"/>
-          <w:tab w:val="left" w:pos="3664"/>
-          <w:tab w:val="left" w:pos="4580"/>
-          <w:tab w:val="left" w:pos="5496"/>
-          <w:tab w:val="left" w:pos="6412"/>
-          <w:tab w:val="left" w:pos="7328"/>
-          <w:tab w:val="left" w:pos="8244"/>
-          <w:tab w:val="left" w:pos="9160"/>
-          <w:tab w:val="left" w:pos="10076"/>
-          <w:tab w:val="left" w:pos="10992"/>
-          <w:tab w:val="left" w:pos="11908"/>
-          <w:tab w:val="left" w:pos="12824"/>
-          <w:tab w:val="left" w:pos="13740"/>
-          <w:tab w:val="left" w:pos="14656"/>
-        </w:tabs>
-        <w:spacing w:after="0" w:line="240" w:lineRule="auto"/>
-        <w:rPr>
-          <w:rFonts w:ascii="Courier New" w:eastAsia="Times New Roman" w:hAnsi="Courier New" w:cs="Courier New"/>
-          <w:sz w:val="20"/>
-          <w:szCs w:val="20"/>
-        </w:rPr>
-      </w:pPr>
-      <w:r>
-        <w:rPr>
-          <w:rFonts w:ascii="Courier New" w:eastAsia="Times New Roman" w:hAnsi="Courier New" w:cs="Courier New"/>
-          <w:sz w:val="20"/>
-          <w:szCs w:val="20"/>
-        </w:rPr>
-        <w:t xml:space="preserve">        continue</w:t>
-      </w:r>
-    </w:p>
-    <w:p>
-      <w:pPr>
-        <w:tabs>
-          <w:tab w:val="left" w:pos="916"/>
-          <w:tab w:val="left" w:pos="1832"/>
-          <w:tab w:val="left" w:pos="2748"/>
-          <w:tab w:val="left" w:pos="3664"/>
-          <w:tab w:val="left" w:pos="4580"/>
-          <w:tab w:val="left" w:pos="5496"/>
-          <w:tab w:val="left" w:pos="6412"/>
-          <w:tab w:val="left" w:pos="7328"/>
-          <w:tab w:val="left" w:pos="8244"/>
-          <w:tab w:val="left" w:pos="9160"/>
-          <w:tab w:val="left" w:pos="10076"/>
-          <w:tab w:val="left" w:pos="10992"/>
-          <w:tab w:val="left" w:pos="11908"/>
-          <w:tab w:val="left" w:pos="12824"/>
-          <w:tab w:val="left" w:pos="13740"/>
-          <w:tab w:val="left" w:pos="14656"/>
-        </w:tabs>
-        <w:spacing w:after="0" w:line="240" w:lineRule="auto"/>
-        <w:rPr>
-          <w:rFonts w:ascii="Courier New" w:eastAsia="Times New Roman" w:hAnsi="Courier New" w:cs="Courier New"/>
-          <w:sz w:val="20"/>
-          <w:szCs w:val="20"/>
-        </w:rPr>
-      </w:pPr>
-      <w:r>
-        <w:rPr>
-          <w:rFonts w:ascii="Courier New" w:eastAsia="Times New Roman" w:hAnsi="Courier New" w:cs="Courier New"/>
-          <w:sz w:val="20"/>
-          <w:szCs w:val="20"/>
-        </w:rPr>
         <w:t xml:space="preserve">    print(num)</w:t>
       </w:r>
     </w:p>
@@ -5579,42 +5363,6 @@
           <w:sz w:val="20"/>
           <w:szCs w:val="20"/>
         </w:rPr>
-        <w:t>CopyEdit</w:t>
-      </w:r>
-    </w:p>
-    <w:p>
-      <w:pPr>
-        <w:tabs>
-          <w:tab w:val="left" w:pos="916"/>
-          <w:tab w:val="left" w:pos="1832"/>
-          <w:tab w:val="left" w:pos="2748"/>
-          <w:tab w:val="left" w:pos="3664"/>
-          <w:tab w:val="left" w:pos="4580"/>
-          <w:tab w:val="left" w:pos="5496"/>
-          <w:tab w:val="left" w:pos="6412"/>
-          <w:tab w:val="left" w:pos="7328"/>
-          <w:tab w:val="left" w:pos="8244"/>
-          <w:tab w:val="left" w:pos="9160"/>
-          <w:tab w:val="left" w:pos="10076"/>
-          <w:tab w:val="left" w:pos="10992"/>
-          <w:tab w:val="left" w:pos="11908"/>
-          <w:tab w:val="left" w:pos="12824"/>
-          <w:tab w:val="left" w:pos="13740"/>
-          <w:tab w:val="left" w:pos="14656"/>
-        </w:tabs>
-        <w:spacing w:after="0" w:line="240" w:lineRule="auto"/>
-        <w:rPr>
-          <w:rFonts w:ascii="Courier New" w:eastAsia="Times New Roman" w:hAnsi="Courier New" w:cs="Courier New"/>
-          <w:sz w:val="20"/>
-          <w:szCs w:val="20"/>
-        </w:rPr>
-      </w:pPr>
-      <w:r>
-        <w:rPr>
-          <w:rFonts w:ascii="Courier New" w:eastAsia="Times New Roman" w:hAnsi="Courier New" w:cs="Courier New"/>
-          <w:sz w:val="20"/>
-          <w:szCs w:val="20"/>
-        </w:rPr>
         <w:t>1</w:t>
       </w:r>
     </w:p>
@@ -5800,7 +5548,7 @@
           <w:szCs w:val="24"/>
         </w:rPr>
         <w:pict>
-          <v:rect id="_x0000_i1111" style="width:0;height:1.5pt" o:hralign="center" o:hrstd="t" o:hr="t" fillcolor="#a0a0a0" stroked="f"/>
+          <v:rect id="_x0000_i1040" style="width:0;height:1.5pt" o:hralign="center" o:hrstd="t" o:hr="t" fillcolor="#a0a0a0" stroked="f"/>
         </w:pict>
       </w:r>
     </w:p>
@@ -5955,78 +5703,6 @@
           <w:sz w:val="20"/>
           <w:szCs w:val="20"/>
         </w:rPr>
-        <w:t>python</w:t>
-      </w:r>
-    </w:p>
-    <w:p>
-      <w:pPr>
-        <w:tabs>
-          <w:tab w:val="left" w:pos="916"/>
-          <w:tab w:val="left" w:pos="1832"/>
-          <w:tab w:val="left" w:pos="2748"/>
-          <w:tab w:val="left" w:pos="3664"/>
-          <w:tab w:val="left" w:pos="4580"/>
-          <w:tab w:val="left" w:pos="5496"/>
-          <w:tab w:val="left" w:pos="6412"/>
-          <w:tab w:val="left" w:pos="7328"/>
-          <w:tab w:val="left" w:pos="8244"/>
-          <w:tab w:val="left" w:pos="9160"/>
-          <w:tab w:val="left" w:pos="10076"/>
-          <w:tab w:val="left" w:pos="10992"/>
-          <w:tab w:val="left" w:pos="11908"/>
-          <w:tab w:val="left" w:pos="12824"/>
-          <w:tab w:val="left" w:pos="13740"/>
-          <w:tab w:val="left" w:pos="14656"/>
-        </w:tabs>
-        <w:spacing w:after="0" w:line="240" w:lineRule="auto"/>
-        <w:rPr>
-          <w:rFonts w:ascii="Courier New" w:eastAsia="Times New Roman" w:hAnsi="Courier New" w:cs="Courier New"/>
-          <w:sz w:val="20"/>
-          <w:szCs w:val="20"/>
-        </w:rPr>
-      </w:pPr>
-      <w:r>
-        <w:rPr>
-          <w:rFonts w:ascii="Courier New" w:eastAsia="Times New Roman" w:hAnsi="Courier New" w:cs="Courier New"/>
-          <w:sz w:val="20"/>
-          <w:szCs w:val="20"/>
-        </w:rPr>
-        <w:t>CopyEdit</w:t>
-      </w:r>
-    </w:p>
-    <w:p>
-      <w:pPr>
-        <w:tabs>
-          <w:tab w:val="left" w:pos="916"/>
-          <w:tab w:val="left" w:pos="1832"/>
-          <w:tab w:val="left" w:pos="2748"/>
-          <w:tab w:val="left" w:pos="3664"/>
-          <w:tab w:val="left" w:pos="4580"/>
-          <w:tab w:val="left" w:pos="5496"/>
-          <w:tab w:val="left" w:pos="6412"/>
-          <w:tab w:val="left" w:pos="7328"/>
-          <w:tab w:val="left" w:pos="8244"/>
-          <w:tab w:val="left" w:pos="9160"/>
-          <w:tab w:val="left" w:pos="10076"/>
-          <w:tab w:val="left" w:pos="10992"/>
-          <w:tab w:val="left" w:pos="11908"/>
-          <w:tab w:val="left" w:pos="12824"/>
-          <w:tab w:val="left" w:pos="13740"/>
-          <w:tab w:val="left" w:pos="14656"/>
-        </w:tabs>
-        <w:spacing w:after="0" w:line="240" w:lineRule="auto"/>
-        <w:rPr>
-          <w:rFonts w:ascii="Courier New" w:eastAsia="Times New Roman" w:hAnsi="Courier New" w:cs="Courier New"/>
-          <w:sz w:val="20"/>
-          <w:szCs w:val="20"/>
-        </w:rPr>
-      </w:pPr>
-      <w:r>
-        <w:rPr>
-          <w:rFonts w:ascii="Courier New" w:eastAsia="Times New Roman" w:hAnsi="Courier New" w:cs="Courier New"/>
-          <w:sz w:val="20"/>
-          <w:szCs w:val="20"/>
-        </w:rPr>
         <w:t>for item in iterable:</w:t>
       </w:r>
     </w:p>
@@ -6230,78 +5906,6 @@
           <w:sz w:val="20"/>
           <w:szCs w:val="20"/>
         </w:rPr>
-        <w:t>python</w:t>
-      </w:r>
-    </w:p>
-    <w:p>
-      <w:pPr>
-        <w:tabs>
-          <w:tab w:val="left" w:pos="916"/>
-          <w:tab w:val="left" w:pos="1832"/>
-          <w:tab w:val="left" w:pos="2748"/>
-          <w:tab w:val="left" w:pos="3664"/>
-          <w:tab w:val="left" w:pos="4580"/>
-          <w:tab w:val="left" w:pos="5496"/>
-          <w:tab w:val="left" w:pos="6412"/>
-          <w:tab w:val="left" w:pos="7328"/>
-          <w:tab w:val="left" w:pos="8244"/>
-          <w:tab w:val="left" w:pos="9160"/>
-          <w:tab w:val="left" w:pos="10076"/>
-          <w:tab w:val="left" w:pos="10992"/>
-          <w:tab w:val="left" w:pos="11908"/>
-          <w:tab w:val="left" w:pos="12824"/>
-          <w:tab w:val="left" w:pos="13740"/>
-          <w:tab w:val="left" w:pos="14656"/>
-        </w:tabs>
-        <w:spacing w:after="0" w:line="240" w:lineRule="auto"/>
-        <w:rPr>
-          <w:rFonts w:ascii="Courier New" w:eastAsia="Times New Roman" w:hAnsi="Courier New" w:cs="Courier New"/>
-          <w:sz w:val="20"/>
-          <w:szCs w:val="20"/>
-        </w:rPr>
-      </w:pPr>
-      <w:r>
-        <w:rPr>
-          <w:rFonts w:ascii="Courier New" w:eastAsia="Times New Roman" w:hAnsi="Courier New" w:cs="Courier New"/>
-          <w:sz w:val="20"/>
-          <w:szCs w:val="20"/>
-        </w:rPr>
-        <w:t>CopyEdit</w:t>
-      </w:r>
-    </w:p>
-    <w:p>
-      <w:pPr>
-        <w:tabs>
-          <w:tab w:val="left" w:pos="916"/>
-          <w:tab w:val="left" w:pos="1832"/>
-          <w:tab w:val="left" w:pos="2748"/>
-          <w:tab w:val="left" w:pos="3664"/>
-          <w:tab w:val="left" w:pos="4580"/>
-          <w:tab w:val="left" w:pos="5496"/>
-          <w:tab w:val="left" w:pos="6412"/>
-          <w:tab w:val="left" w:pos="7328"/>
-          <w:tab w:val="left" w:pos="8244"/>
-          <w:tab w:val="left" w:pos="9160"/>
-          <w:tab w:val="left" w:pos="10076"/>
-          <w:tab w:val="left" w:pos="10992"/>
-          <w:tab w:val="left" w:pos="11908"/>
-          <w:tab w:val="left" w:pos="12824"/>
-          <w:tab w:val="left" w:pos="13740"/>
-          <w:tab w:val="left" w:pos="14656"/>
-        </w:tabs>
-        <w:spacing w:after="0" w:line="240" w:lineRule="auto"/>
-        <w:rPr>
-          <w:rFonts w:ascii="Courier New" w:eastAsia="Times New Roman" w:hAnsi="Courier New" w:cs="Courier New"/>
-          <w:sz w:val="20"/>
-          <w:szCs w:val="20"/>
-        </w:rPr>
-      </w:pPr>
-      <w:r>
-        <w:rPr>
-          <w:rFonts w:ascii="Courier New" w:eastAsia="Times New Roman" w:hAnsi="Courier New" w:cs="Courier New"/>
-          <w:sz w:val="20"/>
-          <w:szCs w:val="20"/>
-        </w:rPr>
         <w:t>for num in range(1, 6):</w:t>
       </w:r>
     </w:p>
@@ -6502,78 +6106,6 @@
           <w:sz w:val="20"/>
           <w:szCs w:val="20"/>
         </w:rPr>
-        <w:t>kotlin</w:t>
-      </w:r>
-    </w:p>
-    <w:p>
-      <w:pPr>
-        <w:tabs>
-          <w:tab w:val="left" w:pos="916"/>
-          <w:tab w:val="left" w:pos="1832"/>
-          <w:tab w:val="left" w:pos="2748"/>
-          <w:tab w:val="left" w:pos="3664"/>
-          <w:tab w:val="left" w:pos="4580"/>
-          <w:tab w:val="left" w:pos="5496"/>
-          <w:tab w:val="left" w:pos="6412"/>
-          <w:tab w:val="left" w:pos="7328"/>
-          <w:tab w:val="left" w:pos="8244"/>
-          <w:tab w:val="left" w:pos="9160"/>
-          <w:tab w:val="left" w:pos="10076"/>
-          <w:tab w:val="left" w:pos="10992"/>
-          <w:tab w:val="left" w:pos="11908"/>
-          <w:tab w:val="left" w:pos="12824"/>
-          <w:tab w:val="left" w:pos="13740"/>
-          <w:tab w:val="left" w:pos="14656"/>
-        </w:tabs>
-        <w:spacing w:after="0" w:line="240" w:lineRule="auto"/>
-        <w:rPr>
-          <w:rFonts w:ascii="Courier New" w:eastAsia="Times New Roman" w:hAnsi="Courier New" w:cs="Courier New"/>
-          <w:sz w:val="20"/>
-          <w:szCs w:val="20"/>
-        </w:rPr>
-      </w:pPr>
-      <w:r>
-        <w:rPr>
-          <w:rFonts w:ascii="Courier New" w:eastAsia="Times New Roman" w:hAnsi="Courier New" w:cs="Courier New"/>
-          <w:sz w:val="20"/>
-          <w:szCs w:val="20"/>
-        </w:rPr>
-        <w:t>CopyEdit</w:t>
-      </w:r>
-    </w:p>
-    <w:p>
-      <w:pPr>
-        <w:tabs>
-          <w:tab w:val="left" w:pos="916"/>
-          <w:tab w:val="left" w:pos="1832"/>
-          <w:tab w:val="left" w:pos="2748"/>
-          <w:tab w:val="left" w:pos="3664"/>
-          <w:tab w:val="left" w:pos="4580"/>
-          <w:tab w:val="left" w:pos="5496"/>
-          <w:tab w:val="left" w:pos="6412"/>
-          <w:tab w:val="left" w:pos="7328"/>
-          <w:tab w:val="left" w:pos="8244"/>
-          <w:tab w:val="left" w:pos="9160"/>
-          <w:tab w:val="left" w:pos="10076"/>
-          <w:tab w:val="left" w:pos="10992"/>
-          <w:tab w:val="left" w:pos="11908"/>
-          <w:tab w:val="left" w:pos="12824"/>
-          <w:tab w:val="left" w:pos="13740"/>
-          <w:tab w:val="left" w:pos="14656"/>
-        </w:tabs>
-        <w:spacing w:after="0" w:line="240" w:lineRule="auto"/>
-        <w:rPr>
-          <w:rFonts w:ascii="Courier New" w:eastAsia="Times New Roman" w:hAnsi="Courier New" w:cs="Courier New"/>
-          <w:sz w:val="20"/>
-          <w:szCs w:val="20"/>
-        </w:rPr>
-      </w:pPr>
-      <w:r>
-        <w:rPr>
-          <w:rFonts w:ascii="Courier New" w:eastAsia="Times New Roman" w:hAnsi="Courier New" w:cs="Courier New"/>
-          <w:sz w:val="20"/>
-          <w:szCs w:val="20"/>
-        </w:rPr>
         <w:t>Loop finished without break!</w:t>
       </w:r>
     </w:p>
@@ -6593,7 +6125,7 @@
           <w:szCs w:val="24"/>
         </w:rPr>
         <w:pict>
-          <v:rect id="_x0000_i1112" style="width:0;height:1.5pt" o:hralign="center" o:hrstd="t" o:hr="t" fillcolor="#a0a0a0" stroked="f"/>
+          <v:rect id="_x0000_i1041" style="width:0;height:1.5pt" o:hralign="center" o:hrstd="t" o:hr="t" fillcolor="#a0a0a0" stroked="f"/>
         </w:pict>
       </w:r>
     </w:p>
@@ -6617,405 +6149,269 @@
           <w:sz w:val="27"/>
           <w:szCs w:val="27"/>
         </w:rPr>
+        <w:t>Example with break:</w:t>
+      </w:r>
+    </w:p>
+    <w:p>
+      <w:pPr>
+        <w:tabs>
+          <w:tab w:val="left" w:pos="916"/>
+          <w:tab w:val="left" w:pos="1832"/>
+          <w:tab w:val="left" w:pos="2748"/>
+          <w:tab w:val="left" w:pos="3664"/>
+          <w:tab w:val="left" w:pos="4580"/>
+          <w:tab w:val="left" w:pos="5496"/>
+          <w:tab w:val="left" w:pos="6412"/>
+          <w:tab w:val="left" w:pos="7328"/>
+          <w:tab w:val="left" w:pos="8244"/>
+          <w:tab w:val="left" w:pos="9160"/>
+          <w:tab w:val="left" w:pos="10076"/>
+          <w:tab w:val="left" w:pos="10992"/>
+          <w:tab w:val="left" w:pos="11908"/>
+          <w:tab w:val="left" w:pos="12824"/>
+          <w:tab w:val="left" w:pos="13740"/>
+          <w:tab w:val="left" w:pos="14656"/>
+        </w:tabs>
+        <w:spacing w:after="0" w:line="240" w:lineRule="auto"/>
+        <w:rPr>
+          <w:rFonts w:ascii="Courier New" w:eastAsia="Times New Roman" w:hAnsi="Courier New" w:cs="Courier New"/>
+          <w:sz w:val="20"/>
+          <w:szCs w:val="20"/>
+        </w:rPr>
+      </w:pPr>
+      <w:r>
+        <w:rPr>
+          <w:rFonts w:ascii="Courier New" w:eastAsia="Times New Roman" w:hAnsi="Courier New" w:cs="Courier New"/>
+          <w:sz w:val="20"/>
+          <w:szCs w:val="20"/>
+        </w:rPr>
+        <w:t>for num in range(1, 6):</w:t>
+      </w:r>
+    </w:p>
+    <w:p>
+      <w:pPr>
+        <w:tabs>
+          <w:tab w:val="left" w:pos="916"/>
+          <w:tab w:val="left" w:pos="1832"/>
+          <w:tab w:val="left" w:pos="2748"/>
+          <w:tab w:val="left" w:pos="3664"/>
+          <w:tab w:val="left" w:pos="4580"/>
+          <w:tab w:val="left" w:pos="5496"/>
+          <w:tab w:val="left" w:pos="6412"/>
+          <w:tab w:val="left" w:pos="7328"/>
+          <w:tab w:val="left" w:pos="8244"/>
+          <w:tab w:val="left" w:pos="9160"/>
+          <w:tab w:val="left" w:pos="10076"/>
+          <w:tab w:val="left" w:pos="10992"/>
+          <w:tab w:val="left" w:pos="11908"/>
+          <w:tab w:val="left" w:pos="12824"/>
+          <w:tab w:val="left" w:pos="13740"/>
+          <w:tab w:val="left" w:pos="14656"/>
+        </w:tabs>
+        <w:spacing w:after="0" w:line="240" w:lineRule="auto"/>
+        <w:rPr>
+          <w:rFonts w:ascii="Courier New" w:eastAsia="Times New Roman" w:hAnsi="Courier New" w:cs="Courier New"/>
+          <w:sz w:val="20"/>
+          <w:szCs w:val="20"/>
+        </w:rPr>
+      </w:pPr>
+      <w:r>
+        <w:rPr>
+          <w:rFonts w:ascii="Courier New" w:eastAsia="Times New Roman" w:hAnsi="Courier New" w:cs="Courier New"/>
+          <w:sz w:val="20"/>
+          <w:szCs w:val="20"/>
+        </w:rPr>
+        <w:t xml:space="preserve">    if num == 3:</w:t>
+      </w:r>
+    </w:p>
+    <w:p>
+      <w:pPr>
+        <w:tabs>
+          <w:tab w:val="left" w:pos="916"/>
+          <w:tab w:val="left" w:pos="1832"/>
+          <w:tab w:val="left" w:pos="2748"/>
+          <w:tab w:val="left" w:pos="3664"/>
+          <w:tab w:val="left" w:pos="4580"/>
+          <w:tab w:val="left" w:pos="5496"/>
+          <w:tab w:val="left" w:pos="6412"/>
+          <w:tab w:val="left" w:pos="7328"/>
+          <w:tab w:val="left" w:pos="8244"/>
+          <w:tab w:val="left" w:pos="9160"/>
+          <w:tab w:val="left" w:pos="10076"/>
+          <w:tab w:val="left" w:pos="10992"/>
+          <w:tab w:val="left" w:pos="11908"/>
+          <w:tab w:val="left" w:pos="12824"/>
+          <w:tab w:val="left" w:pos="13740"/>
+          <w:tab w:val="left" w:pos="14656"/>
+        </w:tabs>
+        <w:spacing w:after="0" w:line="240" w:lineRule="auto"/>
+        <w:rPr>
+          <w:rFonts w:ascii="Courier New" w:eastAsia="Times New Roman" w:hAnsi="Courier New" w:cs="Courier New"/>
+          <w:sz w:val="20"/>
+          <w:szCs w:val="20"/>
+        </w:rPr>
+      </w:pPr>
+      <w:r>
+        <w:rPr>
+          <w:rFonts w:ascii="Courier New" w:eastAsia="Times New Roman" w:hAnsi="Courier New" w:cs="Courier New"/>
+          <w:sz w:val="20"/>
+          <w:szCs w:val="20"/>
+        </w:rPr>
+        <w:t xml:space="preserve">        break</w:t>
+      </w:r>
+    </w:p>
+    <w:p>
+      <w:pPr>
+        <w:tabs>
+          <w:tab w:val="left" w:pos="916"/>
+          <w:tab w:val="left" w:pos="1832"/>
+          <w:tab w:val="left" w:pos="2748"/>
+          <w:tab w:val="left" w:pos="3664"/>
+          <w:tab w:val="left" w:pos="4580"/>
+          <w:tab w:val="left" w:pos="5496"/>
+          <w:tab w:val="left" w:pos="6412"/>
+          <w:tab w:val="left" w:pos="7328"/>
+          <w:tab w:val="left" w:pos="8244"/>
+          <w:tab w:val="left" w:pos="9160"/>
+          <w:tab w:val="left" w:pos="10076"/>
+          <w:tab w:val="left" w:pos="10992"/>
+          <w:tab w:val="left" w:pos="11908"/>
+          <w:tab w:val="left" w:pos="12824"/>
+          <w:tab w:val="left" w:pos="13740"/>
+          <w:tab w:val="left" w:pos="14656"/>
+        </w:tabs>
+        <w:spacing w:after="0" w:line="240" w:lineRule="auto"/>
+        <w:rPr>
+          <w:rFonts w:ascii="Courier New" w:eastAsia="Times New Roman" w:hAnsi="Courier New" w:cs="Courier New"/>
+          <w:sz w:val="20"/>
+          <w:szCs w:val="20"/>
+        </w:rPr>
+      </w:pPr>
+      <w:r>
+        <w:rPr>
+          <w:rFonts w:ascii="Courier New" w:eastAsia="Times New Roman" w:hAnsi="Courier New" w:cs="Courier New"/>
+          <w:sz w:val="20"/>
+          <w:szCs w:val="20"/>
+        </w:rPr>
+        <w:t>else:</w:t>
+      </w:r>
+    </w:p>
+    <w:p>
+      <w:pPr>
+        <w:tabs>
+          <w:tab w:val="left" w:pos="916"/>
+          <w:tab w:val="left" w:pos="1832"/>
+          <w:tab w:val="left" w:pos="2748"/>
+          <w:tab w:val="left" w:pos="3664"/>
+          <w:tab w:val="left" w:pos="4580"/>
+          <w:tab w:val="left" w:pos="5496"/>
+          <w:tab w:val="left" w:pos="6412"/>
+          <w:tab w:val="left" w:pos="7328"/>
+          <w:tab w:val="left" w:pos="8244"/>
+          <w:tab w:val="left" w:pos="9160"/>
+          <w:tab w:val="left" w:pos="10076"/>
+          <w:tab w:val="left" w:pos="10992"/>
+          <w:tab w:val="left" w:pos="11908"/>
+          <w:tab w:val="left" w:pos="12824"/>
+          <w:tab w:val="left" w:pos="13740"/>
+          <w:tab w:val="left" w:pos="14656"/>
+        </w:tabs>
+        <w:spacing w:after="0" w:line="240" w:lineRule="auto"/>
+        <w:rPr>
+          <w:rFonts w:ascii="Courier New" w:eastAsia="Times New Roman" w:hAnsi="Courier New" w:cs="Courier New"/>
+          <w:sz w:val="20"/>
+          <w:szCs w:val="20"/>
+        </w:rPr>
+      </w:pPr>
+      <w:r>
+        <w:rPr>
+          <w:rFonts w:ascii="Courier New" w:eastAsia="Times New Roman" w:hAnsi="Courier New" w:cs="Courier New"/>
+          <w:sz w:val="20"/>
+          <w:szCs w:val="20"/>
+        </w:rPr>
+        <w:t xml:space="preserve">    print("Loop finished without break!")</w:t>
+      </w:r>
+    </w:p>
+    <w:p>
+      <w:pPr>
+        <w:spacing w:before="100" w:beforeAutospacing="1" w:after="100" w:afterAutospacing="1" w:line="240" w:lineRule="auto"/>
+        <w:rPr>
+          <w:rFonts w:ascii="Times New Roman" w:eastAsia="Times New Roman" w:hAnsi="Times New Roman" w:cs="Times New Roman"/>
+          <w:sz w:val="24"/>
+          <w:szCs w:val="24"/>
+        </w:rPr>
+      </w:pPr>
+      <w:r>
+        <w:rPr>
+          <w:rFonts w:ascii="Times New Roman" w:eastAsia="Times New Roman" w:hAnsi="Times New Roman" w:cs="Times New Roman"/>
+          <w:b/>
+          <w:bCs/>
+          <w:sz w:val="24"/>
+          <w:szCs w:val="24"/>
+        </w:rPr>
+        <w:t>Output:</w:t>
+      </w:r>
+    </w:p>
+    <w:p>
+      <w:pPr>
+        <w:tabs>
+          <w:tab w:val="left" w:pos="916"/>
+          <w:tab w:val="left" w:pos="1832"/>
+          <w:tab w:val="left" w:pos="2748"/>
+          <w:tab w:val="left" w:pos="3664"/>
+          <w:tab w:val="left" w:pos="4580"/>
+          <w:tab w:val="left" w:pos="5496"/>
+          <w:tab w:val="left" w:pos="6412"/>
+          <w:tab w:val="left" w:pos="7328"/>
+          <w:tab w:val="left" w:pos="8244"/>
+          <w:tab w:val="left" w:pos="9160"/>
+          <w:tab w:val="left" w:pos="10076"/>
+          <w:tab w:val="left" w:pos="10992"/>
+          <w:tab w:val="left" w:pos="11908"/>
+          <w:tab w:val="left" w:pos="12824"/>
+          <w:tab w:val="left" w:pos="13740"/>
+          <w:tab w:val="left" w:pos="14656"/>
+        </w:tabs>
+        <w:spacing w:after="0" w:line="240" w:lineRule="auto"/>
+        <w:rPr>
+          <w:rFonts w:ascii="Courier New" w:eastAsia="Times New Roman" w:hAnsi="Courier New" w:cs="Courier New"/>
+          <w:sz w:val="20"/>
+          <w:szCs w:val="20"/>
+        </w:rPr>
+      </w:pPr>
+      <w:r>
+        <w:rPr>
+          <w:rFonts w:ascii="Courier New" w:eastAsia="Times New Roman" w:hAnsi="Courier New" w:cs="Courier New"/>
+          <w:sz w:val="20"/>
+          <w:szCs w:val="20"/>
+        </w:rPr>
+        <w:t xml:space="preserve"> </w:t>
+      </w:r>
+      <w:r>
+        <w:rPr>
+          <w:rFonts w:ascii="Courier New" w:eastAsia="Times New Roman" w:hAnsi="Courier New" w:cs="Courier New"/>
+          <w:sz w:val="20"/>
+          <w:szCs w:val="20"/>
+        </w:rPr>
+        <w:t>(no output from else)</w:t>
+      </w:r>
+    </w:p>
+    <w:p>
+      <w:pPr>
+        <w:spacing w:before="100" w:beforeAutospacing="1" w:after="100" w:afterAutospacing="1" w:line="240" w:lineRule="auto"/>
+        <w:rPr>
+          <w:rFonts w:ascii="Times New Roman" w:eastAsia="Times New Roman" w:hAnsi="Times New Roman" w:cs="Times New Roman"/>
+          <w:sz w:val="24"/>
+          <w:szCs w:val="24"/>
+        </w:rPr>
+      </w:pPr>
+      <w:r>
+        <w:rPr>
+          <w:rFonts w:ascii="Segoe UI Symbol" w:eastAsia="Times New Roman" w:hAnsi="Segoe UI Symbol" w:cs="Segoe UI Symbol"/>
+          <w:sz w:val="24"/>
+          <w:szCs w:val="24"/>
+        </w:rPr>
         <w:lastRenderedPageBreak/>
-        <w:t>Example with break:</w:t>
-      </w:r>
-    </w:p>
-    <w:p>
-      <w:pPr>
-        <w:tabs>
-          <w:tab w:val="left" w:pos="916"/>
-          <w:tab w:val="left" w:pos="1832"/>
-          <w:tab w:val="left" w:pos="2748"/>
-          <w:tab w:val="left" w:pos="3664"/>
-          <w:tab w:val="left" w:pos="4580"/>
-          <w:tab w:val="left" w:pos="5496"/>
-          <w:tab w:val="left" w:pos="6412"/>
-          <w:tab w:val="left" w:pos="7328"/>
-          <w:tab w:val="left" w:pos="8244"/>
-          <w:tab w:val="left" w:pos="9160"/>
-          <w:tab w:val="left" w:pos="10076"/>
-          <w:tab w:val="left" w:pos="10992"/>
-          <w:tab w:val="left" w:pos="11908"/>
-          <w:tab w:val="left" w:pos="12824"/>
-          <w:tab w:val="left" w:pos="13740"/>
-          <w:tab w:val="left" w:pos="14656"/>
-        </w:tabs>
-        <w:spacing w:after="0" w:line="240" w:lineRule="auto"/>
-        <w:rPr>
-          <w:rFonts w:ascii="Courier New" w:eastAsia="Times New Roman" w:hAnsi="Courier New" w:cs="Courier New"/>
-          <w:sz w:val="20"/>
-          <w:szCs w:val="20"/>
-        </w:rPr>
-      </w:pPr>
-      <w:r>
-        <w:rPr>
-          <w:rFonts w:ascii="Courier New" w:eastAsia="Times New Roman" w:hAnsi="Courier New" w:cs="Courier New"/>
-          <w:sz w:val="20"/>
-          <w:szCs w:val="20"/>
-        </w:rPr>
-        <w:t>python</w:t>
-      </w:r>
-    </w:p>
-    <w:p>
-      <w:pPr>
-        <w:tabs>
-          <w:tab w:val="left" w:pos="916"/>
-          <w:tab w:val="left" w:pos="1832"/>
-          <w:tab w:val="left" w:pos="2748"/>
-          <w:tab w:val="left" w:pos="3664"/>
-          <w:tab w:val="left" w:pos="4580"/>
-          <w:tab w:val="left" w:pos="5496"/>
-          <w:tab w:val="left" w:pos="6412"/>
-          <w:tab w:val="left" w:pos="7328"/>
-          <w:tab w:val="left" w:pos="8244"/>
-          <w:tab w:val="left" w:pos="9160"/>
-          <w:tab w:val="left" w:pos="10076"/>
-          <w:tab w:val="left" w:pos="10992"/>
-          <w:tab w:val="left" w:pos="11908"/>
-          <w:tab w:val="left" w:pos="12824"/>
-          <w:tab w:val="left" w:pos="13740"/>
-          <w:tab w:val="left" w:pos="14656"/>
-        </w:tabs>
-        <w:spacing w:after="0" w:line="240" w:lineRule="auto"/>
-        <w:rPr>
-          <w:rFonts w:ascii="Courier New" w:eastAsia="Times New Roman" w:hAnsi="Courier New" w:cs="Courier New"/>
-          <w:sz w:val="20"/>
-          <w:szCs w:val="20"/>
-        </w:rPr>
-      </w:pPr>
-      <w:r>
-        <w:rPr>
-          <w:rFonts w:ascii="Courier New" w:eastAsia="Times New Roman" w:hAnsi="Courier New" w:cs="Courier New"/>
-          <w:sz w:val="20"/>
-          <w:szCs w:val="20"/>
-        </w:rPr>
-        <w:t>CopyEdit</w:t>
-      </w:r>
-    </w:p>
-    <w:p>
-      <w:pPr>
-        <w:tabs>
-          <w:tab w:val="left" w:pos="916"/>
-          <w:tab w:val="left" w:pos="1832"/>
-          <w:tab w:val="left" w:pos="2748"/>
-          <w:tab w:val="left" w:pos="3664"/>
-          <w:tab w:val="left" w:pos="4580"/>
-          <w:tab w:val="left" w:pos="5496"/>
-          <w:tab w:val="left" w:pos="6412"/>
-          <w:tab w:val="left" w:pos="7328"/>
-          <w:tab w:val="left" w:pos="8244"/>
-          <w:tab w:val="left" w:pos="9160"/>
-          <w:tab w:val="left" w:pos="10076"/>
-          <w:tab w:val="left" w:pos="10992"/>
-          <w:tab w:val="left" w:pos="11908"/>
-          <w:tab w:val="left" w:pos="12824"/>
-          <w:tab w:val="left" w:pos="13740"/>
-          <w:tab w:val="left" w:pos="14656"/>
-        </w:tabs>
-        <w:spacing w:after="0" w:line="240" w:lineRule="auto"/>
-        <w:rPr>
-          <w:rFonts w:ascii="Courier New" w:eastAsia="Times New Roman" w:hAnsi="Courier New" w:cs="Courier New"/>
-          <w:sz w:val="20"/>
-          <w:szCs w:val="20"/>
-        </w:rPr>
-      </w:pPr>
-      <w:r>
-        <w:rPr>
-          <w:rFonts w:ascii="Courier New" w:eastAsia="Times New Roman" w:hAnsi="Courier New" w:cs="Courier New"/>
-          <w:sz w:val="20"/>
-          <w:szCs w:val="20"/>
-        </w:rPr>
-        <w:t>for num in range(1, 6):</w:t>
-      </w:r>
-    </w:p>
-    <w:p>
-      <w:pPr>
-        <w:tabs>
-          <w:tab w:val="left" w:pos="916"/>
-          <w:tab w:val="left" w:pos="1832"/>
-          <w:tab w:val="left" w:pos="2748"/>
-          <w:tab w:val="left" w:pos="3664"/>
-          <w:tab w:val="left" w:pos="4580"/>
-          <w:tab w:val="left" w:pos="5496"/>
-          <w:tab w:val="left" w:pos="6412"/>
-          <w:tab w:val="left" w:pos="7328"/>
-          <w:tab w:val="left" w:pos="8244"/>
-          <w:tab w:val="left" w:pos="9160"/>
-          <w:tab w:val="left" w:pos="10076"/>
-          <w:tab w:val="left" w:pos="10992"/>
-          <w:tab w:val="left" w:pos="11908"/>
-          <w:tab w:val="left" w:pos="12824"/>
-          <w:tab w:val="left" w:pos="13740"/>
-          <w:tab w:val="left" w:pos="14656"/>
-        </w:tabs>
-        <w:spacing w:after="0" w:line="240" w:lineRule="auto"/>
-        <w:rPr>
-          <w:rFonts w:ascii="Courier New" w:eastAsia="Times New Roman" w:hAnsi="Courier New" w:cs="Courier New"/>
-          <w:sz w:val="20"/>
-          <w:szCs w:val="20"/>
-        </w:rPr>
-      </w:pPr>
-      <w:r>
-        <w:rPr>
-          <w:rFonts w:ascii="Courier New" w:eastAsia="Times New Roman" w:hAnsi="Courier New" w:cs="Courier New"/>
-          <w:sz w:val="20"/>
-          <w:szCs w:val="20"/>
-        </w:rPr>
-        <w:t xml:space="preserve">    if num == 3:</w:t>
-      </w:r>
-    </w:p>
-    <w:p>
-      <w:pPr>
-        <w:tabs>
-          <w:tab w:val="left" w:pos="916"/>
-          <w:tab w:val="left" w:pos="1832"/>
-          <w:tab w:val="left" w:pos="2748"/>
-          <w:tab w:val="left" w:pos="3664"/>
-          <w:tab w:val="left" w:pos="4580"/>
-          <w:tab w:val="left" w:pos="5496"/>
-          <w:tab w:val="left" w:pos="6412"/>
-          <w:tab w:val="left" w:pos="7328"/>
-          <w:tab w:val="left" w:pos="8244"/>
-          <w:tab w:val="left" w:pos="9160"/>
-          <w:tab w:val="left" w:pos="10076"/>
-          <w:tab w:val="left" w:pos="10992"/>
-          <w:tab w:val="left" w:pos="11908"/>
-          <w:tab w:val="left" w:pos="12824"/>
-          <w:tab w:val="left" w:pos="13740"/>
-          <w:tab w:val="left" w:pos="14656"/>
-        </w:tabs>
-        <w:spacing w:after="0" w:line="240" w:lineRule="auto"/>
-        <w:rPr>
-          <w:rFonts w:ascii="Courier New" w:eastAsia="Times New Roman" w:hAnsi="Courier New" w:cs="Courier New"/>
-          <w:sz w:val="20"/>
-          <w:szCs w:val="20"/>
-        </w:rPr>
-      </w:pPr>
-      <w:r>
-        <w:rPr>
-          <w:rFonts w:ascii="Courier New" w:eastAsia="Times New Roman" w:hAnsi="Courier New" w:cs="Courier New"/>
-          <w:sz w:val="20"/>
-          <w:szCs w:val="20"/>
-        </w:rPr>
-        <w:t xml:space="preserve">        break</w:t>
-      </w:r>
-    </w:p>
-    <w:p>
-      <w:pPr>
-        <w:tabs>
-          <w:tab w:val="left" w:pos="916"/>
-          <w:tab w:val="left" w:pos="1832"/>
-          <w:tab w:val="left" w:pos="2748"/>
-          <w:tab w:val="left" w:pos="3664"/>
-          <w:tab w:val="left" w:pos="4580"/>
-          <w:tab w:val="left" w:pos="5496"/>
-          <w:tab w:val="left" w:pos="6412"/>
-          <w:tab w:val="left" w:pos="7328"/>
-          <w:tab w:val="left" w:pos="8244"/>
-          <w:tab w:val="left" w:pos="9160"/>
-          <w:tab w:val="left" w:pos="10076"/>
-          <w:tab w:val="left" w:pos="10992"/>
-          <w:tab w:val="left" w:pos="11908"/>
-          <w:tab w:val="left" w:pos="12824"/>
-          <w:tab w:val="left" w:pos="13740"/>
-          <w:tab w:val="left" w:pos="14656"/>
-        </w:tabs>
-        <w:spacing w:after="0" w:line="240" w:lineRule="auto"/>
-        <w:rPr>
-          <w:rFonts w:ascii="Courier New" w:eastAsia="Times New Roman" w:hAnsi="Courier New" w:cs="Courier New"/>
-          <w:sz w:val="20"/>
-          <w:szCs w:val="20"/>
-        </w:rPr>
-      </w:pPr>
-      <w:r>
-        <w:rPr>
-          <w:rFonts w:ascii="Courier New" w:eastAsia="Times New Roman" w:hAnsi="Courier New" w:cs="Courier New"/>
-          <w:sz w:val="20"/>
-          <w:szCs w:val="20"/>
-        </w:rPr>
-        <w:t>else:</w:t>
-      </w:r>
-    </w:p>
-    <w:p>
-      <w:pPr>
-        <w:tabs>
-          <w:tab w:val="left" w:pos="916"/>
-          <w:tab w:val="left" w:pos="1832"/>
-          <w:tab w:val="left" w:pos="2748"/>
-          <w:tab w:val="left" w:pos="3664"/>
-          <w:tab w:val="left" w:pos="4580"/>
-          <w:tab w:val="left" w:pos="5496"/>
-          <w:tab w:val="left" w:pos="6412"/>
-          <w:tab w:val="left" w:pos="7328"/>
-          <w:tab w:val="left" w:pos="8244"/>
-          <w:tab w:val="left" w:pos="9160"/>
-          <w:tab w:val="left" w:pos="10076"/>
-          <w:tab w:val="left" w:pos="10992"/>
-          <w:tab w:val="left" w:pos="11908"/>
-          <w:tab w:val="left" w:pos="12824"/>
-          <w:tab w:val="left" w:pos="13740"/>
-          <w:tab w:val="left" w:pos="14656"/>
-        </w:tabs>
-        <w:spacing w:after="0" w:line="240" w:lineRule="auto"/>
-        <w:rPr>
-          <w:rFonts w:ascii="Courier New" w:eastAsia="Times New Roman" w:hAnsi="Courier New" w:cs="Courier New"/>
-          <w:sz w:val="20"/>
-          <w:szCs w:val="20"/>
-        </w:rPr>
-      </w:pPr>
-      <w:r>
-        <w:rPr>
-          <w:rFonts w:ascii="Courier New" w:eastAsia="Times New Roman" w:hAnsi="Courier New" w:cs="Courier New"/>
-          <w:sz w:val="20"/>
-          <w:szCs w:val="20"/>
-        </w:rPr>
-        <w:t xml:space="preserve">    print("Loop finished without break!")</w:t>
-      </w:r>
-    </w:p>
-    <w:p>
-      <w:pPr>
-        <w:spacing w:before="100" w:beforeAutospacing="1" w:after="100" w:afterAutospacing="1" w:line="240" w:lineRule="auto"/>
-        <w:rPr>
-          <w:rFonts w:ascii="Times New Roman" w:eastAsia="Times New Roman" w:hAnsi="Times New Roman" w:cs="Times New Roman"/>
-          <w:sz w:val="24"/>
-          <w:szCs w:val="24"/>
-        </w:rPr>
-      </w:pPr>
-      <w:r>
-        <w:rPr>
-          <w:rFonts w:ascii="Times New Roman" w:eastAsia="Times New Roman" w:hAnsi="Times New Roman" w:cs="Times New Roman"/>
-          <w:b/>
-          <w:bCs/>
-          <w:sz w:val="24"/>
-          <w:szCs w:val="24"/>
-        </w:rPr>
-        <w:t>Output:</w:t>
-      </w:r>
-    </w:p>
-    <w:p>
-      <w:pPr>
-        <w:tabs>
-          <w:tab w:val="left" w:pos="916"/>
-          <w:tab w:val="left" w:pos="1832"/>
-          <w:tab w:val="left" w:pos="2748"/>
-          <w:tab w:val="left" w:pos="3664"/>
-          <w:tab w:val="left" w:pos="4580"/>
-          <w:tab w:val="left" w:pos="5496"/>
-          <w:tab w:val="left" w:pos="6412"/>
-          <w:tab w:val="left" w:pos="7328"/>
-          <w:tab w:val="left" w:pos="8244"/>
-          <w:tab w:val="left" w:pos="9160"/>
-          <w:tab w:val="left" w:pos="10076"/>
-          <w:tab w:val="left" w:pos="10992"/>
-          <w:tab w:val="left" w:pos="11908"/>
-          <w:tab w:val="left" w:pos="12824"/>
-          <w:tab w:val="left" w:pos="13740"/>
-          <w:tab w:val="left" w:pos="14656"/>
-        </w:tabs>
-        <w:spacing w:after="0" w:line="240" w:lineRule="auto"/>
-        <w:rPr>
-          <w:rFonts w:ascii="Courier New" w:eastAsia="Times New Roman" w:hAnsi="Courier New" w:cs="Courier New"/>
-          <w:sz w:val="20"/>
-          <w:szCs w:val="20"/>
-        </w:rPr>
-      </w:pPr>
-      <w:r>
-        <w:rPr>
-          <w:rFonts w:ascii="Courier New" w:eastAsia="Times New Roman" w:hAnsi="Courier New" w:cs="Courier New"/>
-          <w:sz w:val="20"/>
-          <w:szCs w:val="20"/>
-        </w:rPr>
-        <w:t>pgsql</w:t>
-      </w:r>
-    </w:p>
-    <w:p>
-      <w:pPr>
-        <w:tabs>
-          <w:tab w:val="left" w:pos="916"/>
-          <w:tab w:val="left" w:pos="1832"/>
-          <w:tab w:val="left" w:pos="2748"/>
-          <w:tab w:val="left" w:pos="3664"/>
-          <w:tab w:val="left" w:pos="4580"/>
-          <w:tab w:val="left" w:pos="5496"/>
-          <w:tab w:val="left" w:pos="6412"/>
-          <w:tab w:val="left" w:pos="7328"/>
-          <w:tab w:val="left" w:pos="8244"/>
-          <w:tab w:val="left" w:pos="9160"/>
-          <w:tab w:val="left" w:pos="10076"/>
-          <w:tab w:val="left" w:pos="10992"/>
-          <w:tab w:val="left" w:pos="11908"/>
-          <w:tab w:val="left" w:pos="12824"/>
-          <w:tab w:val="left" w:pos="13740"/>
-          <w:tab w:val="left" w:pos="14656"/>
-        </w:tabs>
-        <w:spacing w:after="0" w:line="240" w:lineRule="auto"/>
-        <w:rPr>
-          <w:rFonts w:ascii="Courier New" w:eastAsia="Times New Roman" w:hAnsi="Courier New" w:cs="Courier New"/>
-          <w:sz w:val="20"/>
-          <w:szCs w:val="20"/>
-        </w:rPr>
-      </w:pPr>
-      <w:r>
-        <w:rPr>
-          <w:rFonts w:ascii="Courier New" w:eastAsia="Times New Roman" w:hAnsi="Courier New" w:cs="Courier New"/>
-          <w:sz w:val="20"/>
-          <w:szCs w:val="20"/>
-        </w:rPr>
-        <w:t>CopyEdit</w:t>
-      </w:r>
-    </w:p>
-    <w:p>
-      <w:pPr>
-        <w:tabs>
-          <w:tab w:val="left" w:pos="916"/>
-          <w:tab w:val="left" w:pos="1832"/>
-          <w:tab w:val="left" w:pos="2748"/>
-          <w:tab w:val="left" w:pos="3664"/>
-          <w:tab w:val="left" w:pos="4580"/>
-          <w:tab w:val="left" w:pos="5496"/>
-          <w:tab w:val="left" w:pos="6412"/>
-          <w:tab w:val="left" w:pos="7328"/>
-          <w:tab w:val="left" w:pos="8244"/>
-          <w:tab w:val="left" w:pos="9160"/>
-          <w:tab w:val="left" w:pos="10076"/>
-          <w:tab w:val="left" w:pos="10992"/>
-          <w:tab w:val="left" w:pos="11908"/>
-          <w:tab w:val="left" w:pos="12824"/>
-          <w:tab w:val="left" w:pos="13740"/>
-          <w:tab w:val="left" w:pos="14656"/>
-        </w:tabs>
-        <w:spacing w:after="0" w:line="240" w:lineRule="auto"/>
-        <w:rPr>
-          <w:rFonts w:ascii="Courier New" w:eastAsia="Times New Roman" w:hAnsi="Courier New" w:cs="Courier New"/>
-          <w:sz w:val="20"/>
-          <w:szCs w:val="20"/>
-        </w:rPr>
-      </w:pPr>
-      <w:r>
-        <w:rPr>
-          <w:rFonts w:ascii="Courier New" w:eastAsia="Times New Roman" w:hAnsi="Courier New" w:cs="Courier New"/>
-          <w:sz w:val="20"/>
-          <w:szCs w:val="20"/>
-        </w:rPr>
-        <w:t>(no output from else)</w:t>
-      </w:r>
-    </w:p>
-    <w:p>
-      <w:pPr>
-        <w:spacing w:before="100" w:beforeAutospacing="1" w:after="100" w:afterAutospacing="1" w:line="240" w:lineRule="auto"/>
-        <w:rPr>
-          <w:rFonts w:ascii="Times New Roman" w:eastAsia="Times New Roman" w:hAnsi="Times New Roman" w:cs="Times New Roman"/>
-          <w:sz w:val="24"/>
-          <w:szCs w:val="24"/>
-        </w:rPr>
-      </w:pPr>
-      <w:r>
-        <w:rPr>
-          <w:rFonts w:ascii="Segoe UI Symbol" w:eastAsia="Times New Roman" w:hAnsi="Segoe UI Symbol" w:cs="Segoe UI Symbol"/>
-          <w:sz w:val="24"/>
-          <w:szCs w:val="24"/>
-        </w:rPr>
         <w:t>👉</w:t>
       </w:r>
       <w:r>
@@ -7077,7 +6473,7 @@
           <w:szCs w:val="24"/>
         </w:rPr>
         <w:pict>
-          <v:rect id="_x0000_i1113" style="width:0;height:1.5pt" o:hralign="center" o:hrstd="t" o:hr="t" fillcolor="#a0a0a0" stroked="f"/>
+          <v:rect id="_x0000_i1042" style="width:0;height:1.5pt" o:hralign="center" o:hrstd="t" o:hr="t" fillcolor="#a0a0a0" stroked="f"/>
         </w:pict>
       </w:r>
     </w:p>
@@ -7722,7 +7118,6 @@
           <w:sz w:val="24"/>
           <w:szCs w:val="24"/>
         </w:rPr>
-        <w:lastRenderedPageBreak/>
         <w:t>✅</w:t>
       </w:r>
       <w:r>
@@ -7766,7 +7161,7 @@
           <w:szCs w:val="24"/>
         </w:rPr>
         <w:pict>
-          <v:rect id="_x0000_i1115" style="width:0;height:1.5pt" o:hralign="center" o:hrstd="t" o:hr="t" fillcolor="#a0a0a0" stroked="f"/>
+          <v:rect id="_x0000_i1043" style="width:0;height:1.5pt" o:hralign="center" o:hrstd="t" o:hr="t" fillcolor="#a0a0a0" stroked="f"/>
         </w:pict>
       </w:r>
     </w:p>
@@ -7925,7 +7320,7 @@
           <w:szCs w:val="24"/>
         </w:rPr>
         <w:pict>
-          <v:rect id="_x0000_i1116" style="width:0;height:1.5pt" o:hralign="center" o:hrstd="t" o:hr="t" fillcolor="#a0a0a0" stroked="f"/>
+          <v:rect id="_x0000_i1044" style="width:0;height:1.5pt" o:hralign="center" o:hrstd="t" o:hr="t" fillcolor="#a0a0a0" stroked="f"/>
         </w:pict>
       </w:r>
     </w:p>
@@ -7997,6 +7392,7 @@
           <w:sz w:val="24"/>
           <w:szCs w:val="24"/>
         </w:rPr>
+        <w:lastRenderedPageBreak/>
         <w:t xml:space="preserve">If lists are unequal, use </w:t>
       </w:r>
       <w:r>
@@ -8268,7 +7664,7 @@
           <w:szCs w:val="24"/>
         </w:rPr>
         <w:pict>
-          <v:rect id="_x0000_i1117" style="width:0;height:1.5pt" o:hralign="center" o:hrstd="t" o:hr="t" fillcolor="#a0a0a0" stroked="f"/>
+          <v:rect id="_x0000_i1045" style="width:0;height:1.5pt" o:hralign="center" o:hrstd="t" o:hr="t" fillcolor="#a0a0a0" stroked="f"/>
         </w:pict>
       </w:r>
     </w:p>
@@ -8495,7 +7891,7 @@
           <w:szCs w:val="24"/>
         </w:rPr>
         <w:pict>
-          <v:rect id="_x0000_i1118" style="width:0;height:1.5pt" o:hralign="center" o:hrstd="t" o:hr="t" fillcolor="#a0a0a0" stroked="f"/>
+          <v:rect id="_x0000_i1046" style="width:0;height:1.5pt" o:hralign="center" o:hrstd="t" o:hr="t" fillcolor="#a0a0a0" stroked="f"/>
         </w:pict>
       </w:r>
     </w:p>
@@ -8838,7 +8234,7 @@
           <w:szCs w:val="24"/>
         </w:rPr>
         <w:pict>
-          <v:rect id="_x0000_i1119" style="width:0;height:1.5pt" o:hralign="center" o:hrstd="t" o:hr="t" fillcolor="#a0a0a0" stroked="f"/>
+          <v:rect id="_x0000_i1047" style="width:0;height:1.5pt" o:hralign="center" o:hrstd="t" o:hr="t" fillcolor="#a0a0a0" stroked="f"/>
         </w:pict>
       </w:r>
     </w:p>
@@ -8890,7 +8286,6 @@
           <w:sz w:val="24"/>
           <w:szCs w:val="24"/>
         </w:rPr>
-        <w:lastRenderedPageBreak/>
         <w:t>You can use loops inside list comprehensions for shorter, readable code.</w:t>
       </w:r>
     </w:p>
@@ -9036,7 +8431,7 @@
           <w:szCs w:val="24"/>
         </w:rPr>
         <w:pict>
-          <v:rect id="_x0000_i1120" style="width:0;height:1.5pt" o:hralign="center" o:hrstd="t" o:hr="t" fillcolor="#a0a0a0" stroked="f"/>
+          <v:rect id="_x0000_i1048" style="width:0;height:1.5pt" o:hralign="center" o:hrstd="t" o:hr="t" fillcolor="#a0a0a0" stroked="f"/>
         </w:pict>
       </w:r>
     </w:p>
@@ -9160,8 +8555,9 @@
           <w:sz w:val="24"/>
           <w:szCs w:val="24"/>
         </w:rPr>
+        <w:lastRenderedPageBreak/>
         <w:pict>
-          <v:rect id="_x0000_i1121" style="width:0;height:1.5pt" o:hralign="center" o:hrstd="t" o:hr="t" fillcolor="#a0a0a0" stroked="f"/>
+          <v:rect id="_x0000_i1049" style="width:0;height:1.5pt" o:hralign="center" o:hrstd="t" o:hr="t" fillcolor="#a0a0a0" stroked="f"/>
         </w:pict>
       </w:r>
     </w:p>
@@ -9424,7 +8820,7 @@
           <w:szCs w:val="24"/>
         </w:rPr>
         <w:pict>
-          <v:rect id="_x0000_i1122" style="width:0;height:1.5pt" o:hralign="center" o:hrstd="t" o:hr="t" fillcolor="#a0a0a0" stroked="f"/>
+          <v:rect id="_x0000_i1050" style="width:0;height:1.5pt" o:hralign="center" o:hrstd="t" o:hr="t" fillcolor="#a0a0a0" stroked="f"/>
         </w:pict>
       </w:r>
     </w:p>
@@ -9715,7 +9111,7 @@
           <w:szCs w:val="24"/>
         </w:rPr>
         <w:pict>
-          <v:rect id="_x0000_i1123" style="width:0;height:1.5pt" o:hralign="center" o:hrstd="t" o:hr="t" fillcolor="#a0a0a0" stroked="f"/>
+          <v:rect id="_x0000_i1051" style="width:0;height:1.5pt" o:hralign="center" o:hrstd="t" o:hr="t" fillcolor="#a0a0a0" stroked="f"/>
         </w:pict>
       </w:r>
     </w:p>
@@ -9904,7 +9300,7 @@
           <w:szCs w:val="24"/>
         </w:rPr>
         <w:pict>
-          <v:rect id="_x0000_i1124" style="width:0;height:1.5pt" o:hralign="center" o:hrstd="t" o:hr="t" fillcolor="#a0a0a0" stroked="f"/>
+          <v:rect id="_x0000_i1052" style="width:0;height:1.5pt" o:hralign="center" o:hrstd="t" o:hr="t" fillcolor="#a0a0a0" stroked="f"/>
         </w:pict>
       </w:r>
     </w:p>
@@ -9957,7 +9353,7 @@
           <w:szCs w:val="24"/>
         </w:rPr>
         <w:pict>
-          <v:rect id="_x0000_i1125" style="width:0;height:1.5pt" o:hralign="center" o:hrstd="t" o:hr="t" fillcolor="#a0a0a0" stroked="f"/>
+          <v:rect id="_x0000_i1053" style="width:0;height:1.5pt" o:hralign="center" o:hrstd="t" o:hr="t" fillcolor="#a0a0a0" stroked="f"/>
         </w:pict>
       </w:r>
     </w:p>
@@ -9981,7 +9377,6 @@
           <w:sz w:val="27"/>
           <w:szCs w:val="27"/>
         </w:rPr>
-        <w:lastRenderedPageBreak/>
         <w:t>1️</w:t>
       </w:r>
       <w:r>
@@ -10157,7 +9552,7 @@
           <w:szCs w:val="24"/>
         </w:rPr>
         <w:pict>
-          <v:rect id="_x0000_i1126" style="width:0;height:1.5pt" o:hralign="center" o:hrstd="t" o:hr="t" fillcolor="#a0a0a0" stroked="f"/>
+          <v:rect id="_x0000_i1054" style="width:0;height:1.5pt" o:hralign="center" o:hrstd="t" o:hr="t" fillcolor="#a0a0a0" stroked="f"/>
         </w:pict>
       </w:r>
     </w:p>
@@ -10309,6 +9704,7 @@
           <w:sz w:val="20"/>
           <w:szCs w:val="20"/>
         </w:rPr>
+        <w:lastRenderedPageBreak/>
         <w:t xml:space="preserve">    print(fruit)</w:t>
       </w:r>
     </w:p>
@@ -10328,7 +9724,7 @@
           <w:szCs w:val="24"/>
         </w:rPr>
         <w:pict>
-          <v:rect id="_x0000_i1127" style="width:0;height:1.5pt" o:hralign="center" o:hrstd="t" o:hr="t" fillcolor="#a0a0a0" stroked="f"/>
+          <v:rect id="_x0000_i1055" style="width:0;height:1.5pt" o:hralign="center" o:hrstd="t" o:hr="t" fillcolor="#a0a0a0" stroked="f"/>
         </w:pict>
       </w:r>
     </w:p>
@@ -10463,7 +9859,7 @@
           <w:szCs w:val="24"/>
         </w:rPr>
         <w:pict>
-          <v:rect id="_x0000_i1128" style="width:0;height:1.5pt" o:hralign="center" o:hrstd="t" o:hr="t" fillcolor="#a0a0a0" stroked="f"/>
+          <v:rect id="_x0000_i1056" style="width:0;height:1.5pt" o:hralign="center" o:hrstd="t" o:hr="t" fillcolor="#a0a0a0" stroked="f"/>
         </w:pict>
       </w:r>
     </w:p>
@@ -10710,7 +10106,7 @@
           <w:szCs w:val="24"/>
         </w:rPr>
         <w:pict>
-          <v:rect id="_x0000_i1129" style="width:0;height:1.5pt" o:hralign="center" o:hrstd="t" o:hr="t" fillcolor="#a0a0a0" stroked="f"/>
+          <v:rect id="_x0000_i1057" style="width:0;height:1.5pt" o:hralign="center" o:hrstd="t" o:hr="t" fillcolor="#a0a0a0" stroked="f"/>
         </w:pict>
       </w:r>
     </w:p>
@@ -10957,7 +10353,7 @@
           <w:szCs w:val="24"/>
         </w:rPr>
         <w:pict>
-          <v:rect id="_x0000_i1130" style="width:0;height:1.5pt" o:hralign="center" o:hrstd="t" o:hr="t" fillcolor="#a0a0a0" stroked="f"/>
+          <v:rect id="_x0000_i1058" style="width:0;height:1.5pt" o:hralign="center" o:hrstd="t" o:hr="t" fillcolor="#a0a0a0" stroked="f"/>
         </w:pict>
       </w:r>
     </w:p>
@@ -11084,7 +10480,7 @@
           <w:szCs w:val="24"/>
         </w:rPr>
         <w:pict>
-          <v:rect id="_x0000_i1131" style="width:0;height:1.5pt" o:hralign="center" o:hrstd="t" o:hr="t" fillcolor="#a0a0a0" stroked="f"/>
+          <v:rect id="_x0000_i1059" style="width:0;height:1.5pt" o:hralign="center" o:hrstd="t" o:hr="t" fillcolor="#a0a0a0" stroked="f"/>
         </w:pict>
       </w:r>
     </w:p>
@@ -11108,7 +10504,6 @@
           <w:sz w:val="27"/>
           <w:szCs w:val="27"/>
         </w:rPr>
-        <w:lastRenderedPageBreak/>
         <w:t>7️</w:t>
       </w:r>
       <w:r>
@@ -11292,7 +10687,7 @@
           <w:szCs w:val="24"/>
         </w:rPr>
         <w:pict>
-          <v:rect id="_x0000_i1132" style="width:0;height:1.5pt" o:hralign="center" o:hrstd="t" o:hr="t" fillcolor="#a0a0a0" stroked="f"/>
+          <v:rect id="_x0000_i1060" style="width:0;height:1.5pt" o:hralign="center" o:hrstd="t" o:hr="t" fillcolor="#a0a0a0" stroked="f"/>
         </w:pict>
       </w:r>
     </w:p>
@@ -11427,7 +10822,7 @@
           <w:szCs w:val="24"/>
         </w:rPr>
         <w:pict>
-          <v:rect id="_x0000_i1133" style="width:0;height:1.5pt" o:hralign="center" o:hrstd="t" o:hr="t" fillcolor="#a0a0a0" stroked="f"/>
+          <v:rect id="_x0000_i1061" style="width:0;height:1.5pt" o:hralign="center" o:hrstd="t" o:hr="t" fillcolor="#a0a0a0" stroked="f"/>
         </w:pict>
       </w:r>
     </w:p>
@@ -11451,6 +10846,7 @@
           <w:sz w:val="27"/>
           <w:szCs w:val="27"/>
         </w:rPr>
+        <w:lastRenderedPageBreak/>
         <w:t>9️</w:t>
       </w:r>
       <w:r>
@@ -11598,7 +10994,7 @@
           <w:szCs w:val="24"/>
         </w:rPr>
         <w:pict>
-          <v:rect id="_x0000_i1134" style="width:0;height:1.5pt" o:hralign="center" o:hrstd="t" o:hr="t" fillcolor="#a0a0a0" stroked="f"/>
+          <v:rect id="_x0000_i1062" style="width:0;height:1.5pt" o:hralign="center" o:hrstd="t" o:hr="t" fillcolor="#a0a0a0" stroked="f"/>
         </w:pict>
       </w:r>
     </w:p>
@@ -11723,7 +11119,7 @@
           <w:szCs w:val="24"/>
         </w:rPr>
         <w:pict>
-          <v:rect id="_x0000_i1135" style="width:0;height:1.5pt" o:hralign="center" o:hrstd="t" o:hr="t" fillcolor="#a0a0a0" stroked="f"/>
+          <v:rect id="_x0000_i1063" style="width:0;height:1.5pt" o:hralign="center" o:hrstd="t" o:hr="t" fillcolor="#a0a0a0" stroked="f"/>
         </w:pict>
       </w:r>
     </w:p>
@@ -11930,7 +11326,7 @@
           <w:szCs w:val="24"/>
         </w:rPr>
         <w:pict>
-          <v:rect id="_x0000_i1136" style="width:0;height:1.5pt" o:hralign="center" o:hrstd="t" o:hr="t" fillcolor="#a0a0a0" stroked="f"/>
+          <v:rect id="_x0000_i1064" style="width:0;height:1.5pt" o:hralign="center" o:hrstd="t" o:hr="t" fillcolor="#a0a0a0" stroked="f"/>
         </w:pict>
       </w:r>
     </w:p>
@@ -12173,7 +11569,7 @@
           <w:szCs w:val="24"/>
         </w:rPr>
         <w:pict>
-          <v:rect id="_x0000_i1137" style="width:0;height:1.5pt" o:hralign="center" o:hrstd="t" o:hr="t" fillcolor="#a0a0a0" stroked="f"/>
+          <v:rect id="_x0000_i1065" style="width:0;height:1.5pt" o:hralign="center" o:hrstd="t" o:hr="t" fillcolor="#a0a0a0" stroked="f"/>
         </w:pict>
       </w:r>
     </w:p>
@@ -12361,7 +11757,6 @@
           <w:sz w:val="20"/>
           <w:szCs w:val="20"/>
         </w:rPr>
-        <w:lastRenderedPageBreak/>
         <w:t xml:space="preserve">    rev = ch + rev</w:t>
       </w:r>
     </w:p>
@@ -12417,7 +11812,7 @@
           <w:szCs w:val="24"/>
         </w:rPr>
         <w:pict>
-          <v:rect id="_x0000_i1138" style="width:0;height:1.5pt" o:hralign="center" o:hrstd="t" o:hr="t" fillcolor="#a0a0a0" stroked="f"/>
+          <v:rect id="_x0000_i1066" style="width:0;height:1.5pt" o:hralign="center" o:hrstd="t" o:hr="t" fillcolor="#a0a0a0" stroked="f"/>
         </w:pict>
       </w:r>
     </w:p>
@@ -12696,7 +12091,7 @@
           <w:szCs w:val="24"/>
         </w:rPr>
         <w:pict>
-          <v:rect id="_x0000_i1139" style="width:0;height:1.5pt" o:hralign="center" o:hrstd="t" o:hr="t" fillcolor="#a0a0a0" stroked="f"/>
+          <v:rect id="_x0000_i1067" style="width:0;height:1.5pt" o:hralign="center" o:hrstd="t" o:hr="t" fillcolor="#a0a0a0" stroked="f"/>
         </w:pict>
       </w:r>
     </w:p>
@@ -12720,6 +12115,7 @@
           <w:sz w:val="27"/>
           <w:szCs w:val="27"/>
         </w:rPr>
+        <w:lastRenderedPageBreak/>
         <w:t>15️</w:t>
       </w:r>
       <w:r>
@@ -12867,7 +12263,7 @@
           <w:szCs w:val="24"/>
         </w:rPr>
         <w:pict>
-          <v:rect id="_x0000_i1140" style="width:0;height:1.5pt" o:hralign="center" o:hrstd="t" o:hr="t" fillcolor="#a0a0a0" stroked="f"/>
+          <v:rect id="_x0000_i1068" style="width:0;height:1.5pt" o:hralign="center" o:hrstd="t" o:hr="t" fillcolor="#a0a0a0" stroked="f"/>
         </w:pict>
       </w:r>
     </w:p>
@@ -13038,7 +12434,7 @@
           <w:szCs w:val="24"/>
         </w:rPr>
         <w:pict>
-          <v:rect id="_x0000_i1141" style="width:0;height:1.5pt" o:hralign="center" o:hrstd="t" o:hr="t" fillcolor="#a0a0a0" stroked="f"/>
+          <v:rect id="_x0000_i1069" style="width:0;height:1.5pt" o:hralign="center" o:hrstd="t" o:hr="t" fillcolor="#a0a0a0" stroked="f"/>
         </w:pict>
       </w:r>
     </w:p>
@@ -13245,7 +12641,7 @@
           <w:szCs w:val="24"/>
         </w:rPr>
         <w:pict>
-          <v:rect id="_x0000_i1142" style="width:0;height:1.5pt" o:hralign="center" o:hrstd="t" o:hr="t" fillcolor="#a0a0a0" stroked="f"/>
+          <v:rect id="_x0000_i1070" style="width:0;height:1.5pt" o:hralign="center" o:hrstd="t" o:hr="t" fillcolor="#a0a0a0" stroked="f"/>
         </w:pict>
       </w:r>
     </w:p>
@@ -13363,7 +12759,7 @@
           <w:szCs w:val="24"/>
         </w:rPr>
         <w:pict>
-          <v:rect id="_x0000_i1143" style="width:0;height:1.5pt" o:hralign="center" o:hrstd="t" o:hr="t" fillcolor="#a0a0a0" stroked="f"/>
+          <v:rect id="_x0000_i1071" style="width:0;height:1.5pt" o:hralign="center" o:hrstd="t" o:hr="t" fillcolor="#a0a0a0" stroked="f"/>
         </w:pict>
       </w:r>
     </w:p>
@@ -13443,7 +12839,6 @@
           <w:sz w:val="20"/>
           <w:szCs w:val="20"/>
         </w:rPr>
-        <w:lastRenderedPageBreak/>
         <w:t>for ch in "python":</w:t>
       </w:r>
     </w:p>
@@ -13499,7 +12894,7 @@
           <w:szCs w:val="24"/>
         </w:rPr>
         <w:pict>
-          <v:rect id="_x0000_i1144" style="width:0;height:1.5pt" o:hralign="center" o:hrstd="t" o:hr="t" fillcolor="#a0a0a0" stroked="f"/>
+          <v:rect id="_x0000_i1072" style="width:0;height:1.5pt" o:hralign="center" o:hrstd="t" o:hr="t" fillcolor="#a0a0a0" stroked="f"/>
         </w:pict>
       </w:r>
     </w:p>
@@ -13814,7 +13209,7 @@
           <w:szCs w:val="24"/>
         </w:rPr>
         <w:pict>
-          <v:rect id="_x0000_i1145" style="width:0;height:1.5pt" o:hralign="center" o:hrstd="t" o:hr="t" fillcolor="#a0a0a0" stroked="f"/>
+          <v:rect id="_x0000_i1073" style="width:0;height:1.5pt" o:hralign="center" o:hrstd="t" o:hr="t" fillcolor="#a0a0a0" stroked="f"/>
         </w:pict>
       </w:r>
     </w:p>
@@ -13838,6 +13233,7 @@
           <w:sz w:val="27"/>
           <w:szCs w:val="27"/>
         </w:rPr>
+        <w:lastRenderedPageBreak/>
         <w:t>21️</w:t>
       </w:r>
       <w:r>
@@ -14021,7 +13417,7 @@
           <w:szCs w:val="24"/>
         </w:rPr>
         <w:pict>
-          <v:rect id="_x0000_i1146" style="width:0;height:1.5pt" o:hralign="center" o:hrstd="t" o:hr="t" fillcolor="#a0a0a0" stroked="f"/>
+          <v:rect id="_x0000_i1074" style="width:0;height:1.5pt" o:hralign="center" o:hrstd="t" o:hr="t" fillcolor="#a0a0a0" stroked="f"/>
         </w:pict>
       </w:r>
     </w:p>
@@ -14248,7 +13644,7 @@
           <w:szCs w:val="24"/>
         </w:rPr>
         <w:pict>
-          <v:rect id="_x0000_i1147" style="width:0;height:1.5pt" o:hralign="center" o:hrstd="t" o:hr="t" fillcolor="#a0a0a0" stroked="f"/>
+          <v:rect id="_x0000_i1075" style="width:0;height:1.5pt" o:hralign="center" o:hrstd="t" o:hr="t" fillcolor="#a0a0a0" stroked="f"/>
         </w:pict>
       </w:r>
     </w:p>
@@ -14411,7 +13807,7 @@
           <w:szCs w:val="24"/>
         </w:rPr>
         <w:pict>
-          <v:rect id="_x0000_i1148" style="width:0;height:1.5pt" o:hralign="center" o:hrstd="t" o:hr="t" fillcolor="#a0a0a0" stroked="f"/>
+          <v:rect id="_x0000_i1076" style="width:0;height:1.5pt" o:hralign="center" o:hrstd="t" o:hr="t" fillcolor="#a0a0a0" stroked="f"/>
         </w:pict>
       </w:r>
     </w:p>
@@ -14730,7 +14126,7 @@
           <w:szCs w:val="24"/>
         </w:rPr>
         <w:pict>
-          <v:rect id="_x0000_i1149" style="width:0;height:1.5pt" o:hralign="center" o:hrstd="t" o:hr="t" fillcolor="#a0a0a0" stroked="f"/>
+          <v:rect id="_x0000_i1077" style="width:0;height:1.5pt" o:hralign="center" o:hrstd="t" o:hr="t" fillcolor="#a0a0a0" stroked="f"/>
         </w:pict>
       </w:r>
     </w:p>
@@ -14754,7 +14150,6 @@
           <w:sz w:val="27"/>
           <w:szCs w:val="27"/>
         </w:rPr>
-        <w:lastRenderedPageBreak/>
         <w:t>25️</w:t>
       </w:r>
       <w:r>

</xml_diff>